<commit_message>
Added updated document files
Updated ECR-005 and ECR-006 to the most current document
</commit_message>
<xml_diff>
--- a/downloads/SOE - ECR-005 - Secure Network Access.docx
+++ b/downloads/SOE - ECR-005 - Secure Network Access.docx
@@ -284,10 +284,7 @@
           </w:tcPr>
           <w:p>
             <w:r>
-              <w:t xml:space="preserve">Medium </w:t>
-            </w:r>
-            <w:r>
-              <w:t>– Security enhancements may temporarily affect network access or device management if implemented incorrectly, requiring careful validation after deployment.</w:t>
+              <w:t>Medium – Security enhancements may temporarily affect network access or device management if implemented incorrectly, requiring careful validation after deployment.</w:t>
             </w:r>
           </w:p>
         </w:tc>
@@ -351,23 +348,16 @@
     </w:p>
     <w:p>
       <w:pPr>
+        <w:pStyle w:val="ListParagraph"/>
+        <w:numPr>
+          <w:ilvl w:val="0"/>
+          <w:numId w:val="25"/>
+        </w:numPr>
         <w:spacing w:line="276" w:lineRule="auto"/>
-        <w:ind w:left="720"/>
-      </w:pPr>
-      <w:proofErr w:type="gramStart"/>
-      <w:r>
-        <w:rPr>
-          <w:rFonts w:hAnsi="Symbol"/>
-        </w:rPr>
+      </w:pPr>
+      <w:r>
         <w:lastRenderedPageBreak/>
-        <w:t></w:t>
-      </w:r>
-      <w:r>
-        <w:t xml:space="preserve">  Implement</w:t>
-      </w:r>
-      <w:proofErr w:type="gramEnd"/>
-      <w:r>
-        <w:t xml:space="preserve"> an enterprise </w:t>
+        <w:t xml:space="preserve">Implement an enterprise </w:t>
       </w:r>
       <w:proofErr w:type="spellStart"/>
       <w:r>
@@ -388,17 +378,15 @@
     </w:p>
     <w:p>
       <w:pPr>
+        <w:pStyle w:val="ListParagraph"/>
+        <w:numPr>
+          <w:ilvl w:val="0"/>
+          <w:numId w:val="25"/>
+        </w:numPr>
         <w:spacing w:line="276" w:lineRule="auto"/>
-        <w:ind w:left="720"/>
-      </w:pPr>
-      <w:r>
-        <w:rPr>
-          <w:rFonts w:hAnsi="Symbol"/>
-        </w:rPr>
-        <w:t></w:t>
-      </w:r>
-      <w:r>
-        <w:t xml:space="preserve">  Configure enterprise Spanning Tree Protocol (STP) enhancements, including Root Bridge priority, </w:t>
+      </w:pPr>
+      <w:r>
+        <w:t xml:space="preserve">Configure enterprise Spanning Tree Protocol (STP) enhancements, including Root Bridge priority, </w:t>
       </w:r>
       <w:proofErr w:type="spellStart"/>
       <w:r>
@@ -411,62 +399,41 @@
     </w:p>
     <w:p>
       <w:pPr>
+        <w:pStyle w:val="ListParagraph"/>
+        <w:numPr>
+          <w:ilvl w:val="0"/>
+          <w:numId w:val="25"/>
+        </w:numPr>
         <w:spacing w:line="276" w:lineRule="auto"/>
-        <w:ind w:left="720"/>
-      </w:pPr>
-      <w:proofErr w:type="gramStart"/>
-      <w:r>
-        <w:rPr>
-          <w:rFonts w:hAnsi="Symbol"/>
-        </w:rPr>
-        <w:t></w:t>
-      </w:r>
-      <w:r>
-        <w:t xml:space="preserve">  Secure</w:t>
-      </w:r>
-      <w:proofErr w:type="gramEnd"/>
-      <w:r>
-        <w:t xml:space="preserve"> enterprise access ports by implementing Port Security, Sticky MAC addressing, Parking Lot VLANs, and administrative shutdown of unused switch ports. </w:t>
-      </w:r>
-    </w:p>
-    <w:p>
-      <w:pPr>
+      </w:pPr>
+      <w:r>
+        <w:t xml:space="preserve">Secure enterprise access ports by implementing Port Security, Sticky MAC addressing, Parking Lot VLANs, and administrative shutdown of unused switch ports. </w:t>
+      </w:r>
+    </w:p>
+    <w:p>
+      <w:pPr>
+        <w:pStyle w:val="ListParagraph"/>
+        <w:numPr>
+          <w:ilvl w:val="0"/>
+          <w:numId w:val="25"/>
+        </w:numPr>
         <w:spacing w:line="276" w:lineRule="auto"/>
-        <w:ind w:left="720"/>
-      </w:pPr>
-      <w:proofErr w:type="gramStart"/>
-      <w:r>
-        <w:rPr>
-          <w:rFonts w:hAnsi="Symbol"/>
-        </w:rPr>
-        <w:t></w:t>
-      </w:r>
-      <w:r>
-        <w:t xml:space="preserve">  Configure</w:t>
-      </w:r>
-      <w:proofErr w:type="gramEnd"/>
-      <w:r>
-        <w:t xml:space="preserve"> secure remote device management using SSH Version 2, local authentication, RSA encryption keys, and secure VTY access on enterprise routers and switches. </w:t>
-      </w:r>
-    </w:p>
-    <w:p>
-      <w:pPr>
+      </w:pPr>
+      <w:r>
+        <w:t xml:space="preserve">Configure secure remote device management using SSH Version 2, local authentication, RSA encryption keys, and secure VTY access on enterprise routers and switches. </w:t>
+      </w:r>
+    </w:p>
+    <w:p>
+      <w:pPr>
+        <w:pStyle w:val="ListParagraph"/>
+        <w:numPr>
+          <w:ilvl w:val="0"/>
+          <w:numId w:val="25"/>
+        </w:numPr>
         <w:spacing w:line="276" w:lineRule="auto"/>
-        <w:ind w:left="720"/>
-      </w:pPr>
-      <w:proofErr w:type="gramStart"/>
-      <w:r>
-        <w:rPr>
-          <w:rFonts w:hAnsi="Symbol"/>
-        </w:rPr>
-        <w:t></w:t>
-      </w:r>
-      <w:r>
-        <w:t xml:space="preserve">  Verify</w:t>
-      </w:r>
-      <w:proofErr w:type="gramEnd"/>
-      <w:r>
-        <w:t xml:space="preserve"> enterprise network </w:t>
+      </w:pPr>
+      <w:r>
+        <w:t xml:space="preserve">Verify enterprise network </w:t>
       </w:r>
       <w:r>
         <w:t>connectivity</w:t>
@@ -477,17 +444,15 @@
     </w:p>
     <w:p>
       <w:pPr>
+        <w:pStyle w:val="ListParagraph"/>
+        <w:numPr>
+          <w:ilvl w:val="0"/>
+          <w:numId w:val="25"/>
+        </w:numPr>
         <w:spacing w:line="276" w:lineRule="auto"/>
-        <w:ind w:left="720"/>
-      </w:pPr>
-      <w:r>
-        <w:rPr>
-          <w:rFonts w:hAnsi="Symbol"/>
-        </w:rPr>
-        <w:t></w:t>
-      </w:r>
-      <w:r>
-        <w:t xml:space="preserve">  Validate enterprise configurations using Cisco IOS show commands and interpret the operational status of </w:t>
+      </w:pPr>
+      <w:r>
+        <w:t xml:space="preserve">Validate enterprise configurations using Cisco IOS show commands and interpret the operational status of </w:t>
       </w:r>
       <w:proofErr w:type="spellStart"/>
       <w:r>
@@ -500,42 +465,28 @@
     </w:p>
     <w:p>
       <w:pPr>
+        <w:pStyle w:val="ListParagraph"/>
+        <w:numPr>
+          <w:ilvl w:val="0"/>
+          <w:numId w:val="25"/>
+        </w:numPr>
         <w:spacing w:line="276" w:lineRule="auto"/>
-        <w:ind w:left="720"/>
-      </w:pPr>
-      <w:proofErr w:type="gramStart"/>
-      <w:r>
-        <w:rPr>
-          <w:rFonts w:hAnsi="Symbol"/>
-        </w:rPr>
-        <w:t></w:t>
-      </w:r>
-      <w:r>
-        <w:t xml:space="preserve">  Verify</w:t>
-      </w:r>
-      <w:proofErr w:type="gramEnd"/>
-      <w:r>
-        <w:t xml:space="preserve"> compliance with the Enterprise Network Standards Guide through analysis of device configurations and operational output. </w:t>
-      </w:r>
-    </w:p>
-    <w:p>
-      <w:pPr>
+      </w:pPr>
+      <w:r>
+        <w:t xml:space="preserve">Verify compliance with the Enterprise Network Standards Guide through analysis of device configurations and operational output. </w:t>
+      </w:r>
+    </w:p>
+    <w:p>
+      <w:pPr>
+        <w:pStyle w:val="ListParagraph"/>
+        <w:numPr>
+          <w:ilvl w:val="0"/>
+          <w:numId w:val="25"/>
+        </w:numPr>
         <w:spacing w:line="276" w:lineRule="auto"/>
-        <w:ind w:left="720"/>
-      </w:pPr>
-      <w:proofErr w:type="gramStart"/>
-      <w:r>
-        <w:rPr>
-          <w:rFonts w:hAnsi="Symbol"/>
-        </w:rPr>
-        <w:t></w:t>
-      </w:r>
-      <w:r>
-        <w:t xml:space="preserve">  Document</w:t>
-      </w:r>
-      <w:proofErr w:type="gramEnd"/>
-      <w:r>
-        <w:t xml:space="preserve"> and submit an enterprise validation package demonstrating successful implementation of the requested infrastructure security improvements.</w:t>
+      </w:pPr>
+      <w:r>
+        <w:t>Document and submit an enterprise validation package demonstrating successful implementation of the requested infrastructure security improvements.</w:t>
       </w:r>
     </w:p>
     <w:p/>
@@ -702,83 +653,55 @@
     </w:p>
     <w:p>
       <w:pPr>
+        <w:pStyle w:val="ListParagraph"/>
+        <w:numPr>
+          <w:ilvl w:val="0"/>
+          <w:numId w:val="23"/>
+        </w:numPr>
         <w:spacing w:line="276" w:lineRule="auto"/>
-        <w:ind w:left="720"/>
-      </w:pPr>
-      <w:proofErr w:type="gramStart"/>
-      <w:r>
-        <w:rPr>
-          <w:rFonts w:hAnsi="Symbol"/>
-        </w:rPr>
-        <w:t></w:t>
-      </w:r>
-      <w:r>
-        <w:t xml:space="preserve">  Enterprise</w:t>
-      </w:r>
-      <w:proofErr w:type="gramEnd"/>
-      <w:r>
-        <w:t xml:space="preserve"> Network Standards Guide </w:t>
-      </w:r>
-    </w:p>
-    <w:p>
-      <w:pPr>
+      </w:pPr>
+      <w:r>
+        <w:lastRenderedPageBreak/>
+        <w:t xml:space="preserve">Enterprise Network Standards Guide </w:t>
+      </w:r>
+    </w:p>
+    <w:p>
+      <w:pPr>
+        <w:pStyle w:val="ListParagraph"/>
+        <w:numPr>
+          <w:ilvl w:val="0"/>
+          <w:numId w:val="23"/>
+        </w:numPr>
         <w:spacing w:line="276" w:lineRule="auto"/>
-        <w:ind w:left="720"/>
-      </w:pPr>
-      <w:proofErr w:type="gramStart"/>
-      <w:r>
-        <w:rPr>
-          <w:rFonts w:hAnsi="Symbol"/>
-        </w:rPr>
-        <w:lastRenderedPageBreak/>
-        <w:t></w:t>
-      </w:r>
-      <w:r>
-        <w:t xml:space="preserve">  Enterprise</w:t>
-      </w:r>
-      <w:proofErr w:type="gramEnd"/>
-      <w:r>
-        <w:t xml:space="preserve"> IP Addressing Plan </w:t>
-      </w:r>
-    </w:p>
-    <w:p>
-      <w:pPr>
+      </w:pPr>
+      <w:r>
+        <w:t xml:space="preserve">Enterprise IP Addressing Plan </w:t>
+      </w:r>
+    </w:p>
+    <w:p>
+      <w:pPr>
+        <w:pStyle w:val="ListParagraph"/>
+        <w:numPr>
+          <w:ilvl w:val="0"/>
+          <w:numId w:val="23"/>
+        </w:numPr>
         <w:spacing w:line="276" w:lineRule="auto"/>
-        <w:ind w:left="720"/>
-      </w:pPr>
-      <w:proofErr w:type="gramStart"/>
-      <w:r>
-        <w:rPr>
-          <w:rFonts w:hAnsi="Symbol"/>
-        </w:rPr>
-        <w:t></w:t>
-      </w:r>
-      <w:r>
-        <w:t xml:space="preserve">  Enterprise</w:t>
-      </w:r>
-      <w:proofErr w:type="gramEnd"/>
-      <w:r>
-        <w:t xml:space="preserve"> Topology </w:t>
-      </w:r>
-    </w:p>
-    <w:p>
-      <w:pPr>
+      </w:pPr>
+      <w:r>
+        <w:t xml:space="preserve">Enterprise Topology </w:t>
+      </w:r>
+    </w:p>
+    <w:p>
+      <w:pPr>
+        <w:pStyle w:val="ListParagraph"/>
+        <w:numPr>
+          <w:ilvl w:val="0"/>
+          <w:numId w:val="23"/>
+        </w:numPr>
         <w:spacing w:line="276" w:lineRule="auto"/>
-        <w:ind w:left="720"/>
-      </w:pPr>
-      <w:proofErr w:type="gramStart"/>
-      <w:r>
-        <w:rPr>
-          <w:rFonts w:hAnsi="Symbol"/>
-        </w:rPr>
-        <w:t></w:t>
-      </w:r>
-      <w:r>
-        <w:t xml:space="preserve">  Enterprise</w:t>
-      </w:r>
-      <w:proofErr w:type="gramEnd"/>
-      <w:r>
-        <w:t xml:space="preserve"> Change Request (ECR-00</w:t>
+      </w:pPr>
+      <w:r>
+        <w:t>Enterprise Change Request (ECR-00</w:t>
       </w:r>
       <w:r>
         <w:t>5</w:t>
@@ -789,22 +712,15 @@
     </w:p>
     <w:p>
       <w:pPr>
+        <w:pStyle w:val="ListParagraph"/>
+        <w:numPr>
+          <w:ilvl w:val="0"/>
+          <w:numId w:val="23"/>
+        </w:numPr>
         <w:spacing w:line="276" w:lineRule="auto"/>
-        <w:ind w:left="720"/>
-      </w:pPr>
-      <w:proofErr w:type="gramStart"/>
-      <w:r>
-        <w:rPr>
-          <w:rFonts w:hAnsi="Symbol"/>
-        </w:rPr>
-        <w:t></w:t>
-      </w:r>
-      <w:r>
-        <w:t xml:space="preserve">  Lab</w:t>
-      </w:r>
-      <w:proofErr w:type="gramEnd"/>
-      <w:r>
-        <w:t xml:space="preserve"> Process &amp; Expectations Guide</w:t>
+      </w:pPr>
+      <w:r>
+        <w:t>Enterprise Change Request Process &amp; Expectations Guide</w:t>
       </w:r>
     </w:p>
     <w:p>
@@ -876,6 +792,70 @@
       <w:proofErr w:type="spellEnd"/>
       <w:r>
         <w:t>) for this implementation.</w:t>
+      </w:r>
+    </w:p>
+    <w:p>
+      <w:pPr>
+        <w:pStyle w:val="NormalWeb"/>
+        <w:rPr>
+          <w:rStyle w:val="Strong"/>
+        </w:rPr>
+      </w:pPr>
+      <w:r>
+        <w:rPr>
+          <w:rStyle w:val="Strong"/>
+        </w:rPr>
+        <w:t xml:space="preserve">Prepare the Reserved </w:t>
+      </w:r>
+      <w:proofErr w:type="spellStart"/>
+      <w:r>
+        <w:rPr>
+          <w:rStyle w:val="Strong"/>
+        </w:rPr>
+        <w:t>EtherChannel</w:t>
+      </w:r>
+      <w:proofErr w:type="spellEnd"/>
+      <w:r>
+        <w:rPr>
+          <w:rStyle w:val="Strong"/>
+        </w:rPr>
+        <w:t xml:space="preserve"> Interfaces</w:t>
+      </w:r>
+    </w:p>
+    <w:p>
+      <w:pPr>
+        <w:pStyle w:val="NormalWeb"/>
+      </w:pPr>
+      <w:r>
+        <w:t xml:space="preserve">On HQ-S1 and HQ-S2, enable the previously reserved FastEthernet0/2 and FastEthernet0/3 interfaces. Verify that the interfaces are operational before configuring the </w:t>
+      </w:r>
+      <w:proofErr w:type="spellStart"/>
+      <w:r>
+        <w:t>EtherChannel</w:t>
+      </w:r>
+      <w:proofErr w:type="spellEnd"/>
+      <w:r>
+        <w:t>.</w:t>
+      </w:r>
+    </w:p>
+    <w:p>
+      <w:pPr>
+        <w:pStyle w:val="NormalWeb"/>
+        <w:rPr>
+          <w:rStyle w:val="Strong"/>
+        </w:rPr>
+      </w:pPr>
+      <w:r>
+        <w:t xml:space="preserve">Give the links a moment to come up and negotiate, and </w:t>
+      </w:r>
+      <w:r>
+        <w:rPr>
+          <w:rStyle w:val="Strong"/>
+        </w:rPr>
+        <w:t>then</w:t>
+      </w:r>
+      <w:r>
+        <w:t xml:space="preserve"> configure F0/1–F0/3 together as Port-Channel 1.</w:t>
       </w:r>
     </w:p>
     <w:p>
@@ -967,23 +947,160 @@
     </w:p>
     <w:p>
       <w:pPr>
+        <w:pStyle w:val="ListParagraph"/>
+        <w:numPr>
+          <w:ilvl w:val="0"/>
+          <w:numId w:val="23"/>
+        </w:numPr>
         <w:spacing w:line="276" w:lineRule="auto"/>
-        <w:ind w:left="720"/>
-      </w:pPr>
-      <w:proofErr w:type="gramStart"/>
-      <w:r>
-        <w:rPr>
-          <w:rFonts w:hAnsi="Symbol"/>
-        </w:rPr>
-        <w:t></w:t>
-      </w:r>
-      <w:r>
-        <w:t xml:space="preserve">  Configure</w:t>
-      </w:r>
-      <w:proofErr w:type="gramEnd"/>
+      </w:pPr>
+      <w:r>
+        <w:t xml:space="preserve">Configure </w:t>
+      </w:r>
+      <w:r>
+        <w:rPr>
+          <w:rStyle w:val="Strong"/>
+        </w:rPr>
+        <w:t>Port-Channel 1</w:t>
+      </w:r>
+      <w:r>
+        <w:t xml:space="preserve"> between </w:t>
+      </w:r>
+      <w:r>
+        <w:rPr>
+          <w:rStyle w:val="Strong"/>
+        </w:rPr>
+        <w:t>HQ-S1</w:t>
+      </w:r>
+      <w:r>
+        <w:t xml:space="preserve"> and </w:t>
+      </w:r>
+      <w:r>
+        <w:rPr>
+          <w:rStyle w:val="Strong"/>
+        </w:rPr>
+        <w:t>HQ-S2</w:t>
+      </w:r>
+      <w:r>
+        <w:t xml:space="preserve">. </w:t>
+      </w:r>
+    </w:p>
+    <w:p>
+      <w:pPr>
+        <w:pStyle w:val="ListParagraph"/>
+        <w:numPr>
+          <w:ilvl w:val="0"/>
+          <w:numId w:val="23"/>
+        </w:numPr>
+        <w:spacing w:line="276" w:lineRule="auto"/>
+      </w:pPr>
+      <w:r>
+        <w:t xml:space="preserve">Configure </w:t>
+      </w:r>
+      <w:r>
+        <w:rPr>
+          <w:rStyle w:val="Strong"/>
+        </w:rPr>
+        <w:t>HQ-S1</w:t>
+      </w:r>
+      <w:r>
+        <w:t xml:space="preserve"> to use </w:t>
+      </w:r>
+      <w:proofErr w:type="spellStart"/>
+      <w:r>
+        <w:rPr>
+          <w:rStyle w:val="Strong"/>
+        </w:rPr>
+        <w:t>PAgP</w:t>
+      </w:r>
+      <w:proofErr w:type="spellEnd"/>
+      <w:r>
+        <w:rPr>
+          <w:rStyle w:val="Strong"/>
+        </w:rPr>
+        <w:t xml:space="preserve"> desirable</w:t>
+      </w:r>
+      <w:r>
+        <w:t xml:space="preserve"> mode. </w:t>
+      </w:r>
+    </w:p>
+    <w:p>
+      <w:pPr>
+        <w:pStyle w:val="ListParagraph"/>
+        <w:numPr>
+          <w:ilvl w:val="0"/>
+          <w:numId w:val="23"/>
+        </w:numPr>
+        <w:spacing w:line="276" w:lineRule="auto"/>
+      </w:pPr>
+      <w:r>
+        <w:t xml:space="preserve">Configure </w:t>
+      </w:r>
+      <w:r>
+        <w:rPr>
+          <w:rStyle w:val="Strong"/>
+        </w:rPr>
+        <w:t>HQ-S2</w:t>
+      </w:r>
+      <w:r>
+        <w:t xml:space="preserve"> to use </w:t>
+      </w:r>
+      <w:proofErr w:type="spellStart"/>
+      <w:r>
+        <w:rPr>
+          <w:rStyle w:val="Strong"/>
+        </w:rPr>
+        <w:t>PAgP</w:t>
+      </w:r>
+      <w:proofErr w:type="spellEnd"/>
+      <w:r>
+        <w:rPr>
+          <w:rStyle w:val="Strong"/>
+        </w:rPr>
+        <w:t xml:space="preserve"> auto</w:t>
+      </w:r>
+      <w:r>
+        <w:t xml:space="preserve"> mode. </w:t>
+      </w:r>
+    </w:p>
+    <w:p>
+      <w:pPr>
+        <w:pStyle w:val="ListParagraph"/>
+        <w:numPr>
+          <w:ilvl w:val="0"/>
+          <w:numId w:val="23"/>
+        </w:numPr>
+        <w:spacing w:line="276" w:lineRule="auto"/>
+      </w:pPr>
+      <w:r>
+        <w:lastRenderedPageBreak/>
+        <w:t xml:space="preserve">Configure Port-Channel 1 as an 802.1Q trunk and configure </w:t>
+      </w:r>
+      <w:r>
+        <w:rPr>
+          <w:rStyle w:val="Strong"/>
+        </w:rPr>
+        <w:t>VLAN 99 as the native VLAN</w:t>
+      </w:r>
+      <w:r>
+        <w:t>.</w:t>
+      </w:r>
       <w:r>
         <w:t xml:space="preserve"> </w:t>
       </w:r>
+    </w:p>
+    <w:p>
+      <w:pPr>
+        <w:pStyle w:val="ListParagraph"/>
+        <w:numPr>
+          <w:ilvl w:val="0"/>
+          <w:numId w:val="23"/>
+        </w:numPr>
+        <w:spacing w:line="276" w:lineRule="auto"/>
+      </w:pPr>
+      <w:r>
+        <w:t xml:space="preserve">Update the descriptions on both the physical interfaces and </w:t>
+      </w:r>
       <w:r>
         <w:rPr>
           <w:rStyle w:val="Strong"/>
@@ -991,232 +1108,56 @@
         <w:t>Port-Channel 1</w:t>
       </w:r>
       <w:r>
-        <w:t xml:space="preserve"> between </w:t>
+        <w:t xml:space="preserve"> according to the Enterprise Network Standards Guide and the </w:t>
+      </w:r>
+      <w:r>
+        <w:t>Enterprise Change Request Process &amp; Expectations Guide</w:t>
+      </w:r>
+      <w:r>
+        <w:t xml:space="preserve">. </w:t>
+      </w:r>
+    </w:p>
+    <w:p>
+      <w:pPr>
+        <w:pStyle w:val="ListParagraph"/>
+        <w:numPr>
+          <w:ilvl w:val="0"/>
+          <w:numId w:val="23"/>
+        </w:numPr>
+        <w:spacing w:line="276" w:lineRule="auto"/>
+      </w:pPr>
+      <w:r>
+        <w:t xml:space="preserve">Verify that </w:t>
       </w:r>
       <w:r>
         <w:rPr>
           <w:rStyle w:val="Strong"/>
         </w:rPr>
-        <w:t>HQ-S1</w:t>
-      </w:r>
-      <w:r>
-        <w:t xml:space="preserve"> and </w:t>
-      </w:r>
-      <w:r>
-        <w:rPr>
-          <w:rStyle w:val="Strong"/>
-        </w:rPr>
-        <w:t>HQ-S2</w:t>
-      </w:r>
+        <w:t>Port-Channel 1</w:t>
+      </w:r>
+      <w:r>
+        <w:t xml:space="preserve"> is operational and that all member interfaces have successfully joined the </w:t>
+      </w:r>
+      <w:proofErr w:type="spellStart"/>
+      <w:r>
+        <w:t>EtherChannel</w:t>
+      </w:r>
+      <w:proofErr w:type="spellEnd"/>
       <w:r>
         <w:t xml:space="preserve">. </w:t>
       </w:r>
     </w:p>
     <w:p>
       <w:pPr>
-        <w:spacing w:line="276" w:lineRule="auto"/>
-        <w:ind w:left="720"/>
-      </w:pPr>
-      <w:proofErr w:type="gramStart"/>
-      <w:r>
-        <w:rPr>
-          <w:rFonts w:hAnsi="Symbol"/>
-        </w:rPr>
-        <w:t></w:t>
-      </w:r>
-      <w:r>
-        <w:t xml:space="preserve">  Configure</w:t>
-      </w:r>
-      <w:proofErr w:type="gramEnd"/>
-      <w:r>
-        <w:t xml:space="preserve"> </w:t>
-      </w:r>
-      <w:r>
-        <w:rPr>
-          <w:rStyle w:val="Strong"/>
-        </w:rPr>
-        <w:t>HQ-S1</w:t>
-      </w:r>
-      <w:r>
-        <w:t xml:space="preserve"> to use </w:t>
-      </w:r>
-      <w:proofErr w:type="spellStart"/>
-      <w:r>
-        <w:rPr>
-          <w:rStyle w:val="Strong"/>
-        </w:rPr>
-        <w:t>PAgP</w:t>
-      </w:r>
-      <w:proofErr w:type="spellEnd"/>
-      <w:r>
-        <w:rPr>
-          <w:rStyle w:val="Strong"/>
-        </w:rPr>
-        <w:t xml:space="preserve"> desirable</w:t>
-      </w:r>
-      <w:r>
-        <w:t xml:space="preserve"> mode. </w:t>
-      </w:r>
-    </w:p>
-    <w:p>
-      <w:pPr>
-        <w:spacing w:line="276" w:lineRule="auto"/>
-        <w:ind w:left="720"/>
-      </w:pPr>
-      <w:proofErr w:type="gramStart"/>
-      <w:r>
-        <w:rPr>
-          <w:rFonts w:hAnsi="Symbol"/>
-        </w:rPr>
-        <w:t></w:t>
-      </w:r>
-      <w:r>
-        <w:t xml:space="preserve">  Configure</w:t>
-      </w:r>
-      <w:proofErr w:type="gramEnd"/>
-      <w:r>
-        <w:t xml:space="preserve"> </w:t>
-      </w:r>
-      <w:r>
-        <w:rPr>
-          <w:rStyle w:val="Strong"/>
-        </w:rPr>
-        <w:t>HQ-S2</w:t>
-      </w:r>
-      <w:r>
-        <w:t xml:space="preserve"> to use </w:t>
-      </w:r>
-      <w:proofErr w:type="spellStart"/>
-      <w:r>
-        <w:rPr>
-          <w:rStyle w:val="Strong"/>
-        </w:rPr>
-        <w:t>PAgP</w:t>
-      </w:r>
-      <w:proofErr w:type="spellEnd"/>
-      <w:r>
-        <w:rPr>
-          <w:rStyle w:val="Strong"/>
-        </w:rPr>
-        <w:t xml:space="preserve"> auto</w:t>
-      </w:r>
-      <w:r>
-        <w:t xml:space="preserve"> mode. </w:t>
-      </w:r>
-    </w:p>
-    <w:p>
-      <w:pPr>
-        <w:spacing w:line="276" w:lineRule="auto"/>
-        <w:ind w:left="720"/>
-      </w:pPr>
-      <w:proofErr w:type="gramStart"/>
-      <w:r>
-        <w:rPr>
-          <w:rFonts w:hAnsi="Symbol"/>
-        </w:rPr>
-        <w:t></w:t>
-      </w:r>
-      <w:r>
-        <w:t xml:space="preserve">  Configure</w:t>
-      </w:r>
-      <w:proofErr w:type="gramEnd"/>
-      <w:r>
-        <w:t xml:space="preserve"> the Port-Channel interface using the appropriate enterprise </w:t>
-      </w:r>
-      <w:proofErr w:type="spellStart"/>
-      <w:r>
-        <w:t>switchport</w:t>
-      </w:r>
-      <w:proofErr w:type="spellEnd"/>
-      <w:r>
-        <w:t xml:space="preserve"> configuration. </w:t>
-      </w:r>
-    </w:p>
-    <w:p>
-      <w:pPr>
-        <w:spacing w:line="276" w:lineRule="auto"/>
-        <w:ind w:left="720"/>
-      </w:pPr>
-      <w:proofErr w:type="gramStart"/>
-      <w:r>
-        <w:rPr>
-          <w:rFonts w:hAnsi="Symbol"/>
-        </w:rPr>
-        <w:t></w:t>
-      </w:r>
-      <w:r>
-        <w:t xml:space="preserve">  Update</w:t>
-      </w:r>
-      <w:proofErr w:type="gramEnd"/>
-      <w:r>
-        <w:t xml:space="preserve"> the descriptions on both the physical interfaces and </w:t>
-      </w:r>
-      <w:r>
-        <w:rPr>
-          <w:rStyle w:val="Strong"/>
-        </w:rPr>
-        <w:t>Port-Channel 1</w:t>
-      </w:r>
-      <w:r>
-        <w:t xml:space="preserve"> according to the Enterprise Network Standards Guide and the Lab Process &amp; Expectations Guide. </w:t>
-      </w:r>
-    </w:p>
-    <w:p>
-      <w:pPr>
-        <w:spacing w:line="276" w:lineRule="auto"/>
-        <w:ind w:left="720"/>
-      </w:pPr>
-      <w:proofErr w:type="gramStart"/>
-      <w:r>
-        <w:rPr>
-          <w:rFonts w:hAnsi="Symbol"/>
-        </w:rPr>
-        <w:t></w:t>
-      </w:r>
-      <w:r>
-        <w:t xml:space="preserve">  Verify</w:t>
-      </w:r>
-      <w:proofErr w:type="gramEnd"/>
-      <w:r>
-        <w:t xml:space="preserve"> that </w:t>
-      </w:r>
-      <w:r>
-        <w:rPr>
-          <w:rStyle w:val="Strong"/>
-        </w:rPr>
-        <w:t>Port-Channel 1</w:t>
-      </w:r>
-      <w:r>
-        <w:t xml:space="preserve"> is operational and that all member interfaces have successfully joined the </w:t>
-      </w:r>
-      <w:proofErr w:type="spellStart"/>
-      <w:r>
-        <w:t>EtherChannel</w:t>
-      </w:r>
-      <w:proofErr w:type="spellEnd"/>
-      <w:r>
-        <w:t xml:space="preserve">. </w:t>
-      </w:r>
-    </w:p>
-    <w:p>
-      <w:pPr>
         <w:pStyle w:val="pdq2pgselectionanchorcontainer"/>
+        <w:numPr>
+          <w:ilvl w:val="0"/>
+          <w:numId w:val="23"/>
+        </w:numPr>
         <w:spacing w:before="0" w:beforeAutospacing="0" w:line="276" w:lineRule="auto"/>
-        <w:ind w:left="720"/>
-      </w:pPr>
-      <w:proofErr w:type="gramStart"/>
-      <w:r>
-        <w:rPr>
-          <w:rFonts w:hAnsi="Symbol"/>
-        </w:rPr>
-        <w:t></w:t>
-      </w:r>
-      <w:r>
-        <w:t xml:space="preserve">  Troubleshoot</w:t>
-      </w:r>
-      <w:proofErr w:type="gramEnd"/>
-      <w:r>
-        <w:t xml:space="preserve"> and correct any </w:t>
+      </w:pPr>
+      <w:r>
+        <w:t xml:space="preserve">Troubleshoot and correct any </w:t>
       </w:r>
       <w:proofErr w:type="spellStart"/>
       <w:r>
@@ -1246,7 +1187,6 @@
         <w:pStyle w:val="Heading3"/>
       </w:pPr>
       <w:r>
-        <w:lastRenderedPageBreak/>
         <w:t xml:space="preserve">Phase 2 – </w:t>
       </w:r>
       <w:r>
@@ -1288,7 +1228,13 @@
       </w:r>
       <w:proofErr w:type="spellEnd"/>
       <w:r>
-        <w:t>, the Network Engineering Department has approved the next phase of the enterprise access layer modernization project by standardizing the Spanning Tree Protocol (STP) configuration across the headquarters switching infrastructure. Proper STP configuration improves network resiliency, prevents Layer 2 switching loops, protects the enterprise root bridge, and allows end devices to connect more efficiently while reducing the risk of unauthorized or accidental topology changes.</w:t>
+        <w:t xml:space="preserve">, the Network Engineering Department has approved the next phase of the enterprise access layer modernization project by standardizing the Spanning Tree Protocol (STP) configuration across the </w:t>
+      </w:r>
+      <w:r>
+        <w:t>enterprise</w:t>
+      </w:r>
+      <w:r>
+        <w:t xml:space="preserve"> switching infrastructure. Proper STP configuration improves network resiliency, prevents Layer 2 switching loops, protects the enterprise root bridge, and allows end devices to connect more efficiently while reducing the risk of unauthorized or accidental topology changes.</w:t>
       </w:r>
       <w:r>
         <w:t xml:space="preserve"> Root Guard is used to ensure that designated switches cannot unexpectedly become the Root Bridge, helping maintain a stable and predictable spanning-tree topology.</w:t>
@@ -1330,188 +1276,150 @@
     <w:p>
       <w:pPr>
         <w:pStyle w:val="NormalWeb"/>
-      </w:pPr>
-      <w:r>
         <w:rPr>
           <w:rStyle w:val="Strong"/>
         </w:rPr>
+      </w:pPr>
+      <w:r>
+        <w:rPr>
+          <w:rStyle w:val="Strong"/>
+        </w:rPr>
         <w:t>At a minimum:</w:t>
+      </w:r>
+    </w:p>
+    <w:p>
+      <w:pPr>
+        <w:pStyle w:val="NormalWeb"/>
+        <w:rPr>
+          <w:b/>
+        </w:rPr>
+      </w:pPr>
+      <w:r>
+        <w:rPr>
+          <w:b/>
+        </w:rPr>
+        <w:t>Phoenix Headquarters – HQ-S1 and HQ-S2</w:t>
       </w:r>
     </w:p>
     <w:p>
       <w:pPr>
         <w:numPr>
           <w:ilvl w:val="0"/>
-          <w:numId w:val="11"/>
+          <w:numId w:val="27"/>
         </w:numPr>
-        <w:spacing w:before="100" w:beforeAutospacing="1" w:after="100" w:afterAutospacing="1"/>
+        <w:spacing w:before="100" w:beforeAutospacing="1" w:after="100" w:afterAutospacing="1" w:line="276" w:lineRule="auto"/>
       </w:pPr>
       <w:r>
         <w:t xml:space="preserve">Configure </w:t>
       </w:r>
+      <w:proofErr w:type="spellStart"/>
       <w:r>
         <w:rPr>
           <w:rStyle w:val="Strong"/>
         </w:rPr>
-        <w:t>HQ-S2</w:t>
-      </w:r>
-      <w:r>
-        <w:t xml:space="preserve"> as the enterprise Root Bridge. </w:t>
+        <w:t>PortFast</w:t>
+      </w:r>
+      <w:proofErr w:type="spellEnd"/>
+      <w:r>
+        <w:rPr>
+          <w:rStyle w:val="Strong"/>
+        </w:rPr>
+        <w:t xml:space="preserve"> globally</w:t>
+      </w:r>
+      <w:r>
+        <w:t xml:space="preserve"> so that enterprise end-device access ports immediately transition to the forwarding state. </w:t>
       </w:r>
     </w:p>
     <w:p>
       <w:pPr>
         <w:numPr>
           <w:ilvl w:val="0"/>
-          <w:numId w:val="11"/>
+          <w:numId w:val="27"/>
         </w:numPr>
-        <w:spacing w:before="100" w:beforeAutospacing="1" w:after="100" w:afterAutospacing="1"/>
-      </w:pPr>
-      <w:r>
-        <w:t xml:space="preserve">Verify that </w:t>
+        <w:spacing w:before="100" w:beforeAutospacing="1" w:after="100" w:afterAutospacing="1" w:line="276" w:lineRule="auto"/>
+      </w:pPr>
+      <w:r>
+        <w:t xml:space="preserve">Configure </w:t>
       </w:r>
       <w:r>
         <w:rPr>
           <w:rStyle w:val="Strong"/>
         </w:rPr>
-        <w:t>HQ-S1</w:t>
-      </w:r>
-      <w:r>
-        <w:t xml:space="preserve"> is not able to become the Root Bridge. </w:t>
+        <w:t>BPDU Guard globally</w:t>
+      </w:r>
+      <w:r>
+        <w:t xml:space="preserve"> to protect </w:t>
+      </w:r>
+      <w:proofErr w:type="spellStart"/>
+      <w:r>
+        <w:t>PortFast</w:t>
+      </w:r>
+      <w:proofErr w:type="spellEnd"/>
+      <w:r>
+        <w:t xml:space="preserve">-enabled access ports. </w:t>
       </w:r>
     </w:p>
     <w:p>
       <w:pPr>
         <w:numPr>
           <w:ilvl w:val="0"/>
-          <w:numId w:val="11"/>
+          <w:numId w:val="27"/>
         </w:numPr>
-        <w:spacing w:before="100" w:beforeAutospacing="1" w:after="100" w:afterAutospacing="1"/>
+        <w:spacing w:before="100" w:beforeAutospacing="1" w:after="100" w:afterAutospacing="1" w:line="276" w:lineRule="auto"/>
       </w:pPr>
       <w:r>
         <w:t xml:space="preserve">Configure </w:t>
       </w:r>
-      <w:proofErr w:type="spellStart"/>
       <w:r>
         <w:rPr>
           <w:rStyle w:val="Strong"/>
         </w:rPr>
-        <w:t>PortFast</w:t>
-      </w:r>
-      <w:proofErr w:type="spellEnd"/>
-      <w:r>
-        <w:t xml:space="preserve"> globally so that all enterprise access ports immediately transition to the forwarding state. </w:t>
+        <w:t>HQ-S2 as the Root Bridge</w:t>
+      </w:r>
+      <w:r>
+        <w:t xml:space="preserve"> for the implemented enterprise VLANs. </w:t>
       </w:r>
     </w:p>
     <w:p>
       <w:pPr>
         <w:numPr>
           <w:ilvl w:val="0"/>
-          <w:numId w:val="11"/>
+          <w:numId w:val="27"/>
         </w:numPr>
-        <w:spacing w:before="100" w:beforeAutospacing="1" w:after="100" w:afterAutospacing="1"/>
-      </w:pPr>
-      <w:r>
-        <w:t>Ensure</w:t>
-      </w:r>
-      <w:r>
-        <w:t xml:space="preserve"> non-access ports do </w:t>
+        <w:spacing w:before="100" w:beforeAutospacing="1" w:after="100" w:afterAutospacing="1" w:line="276" w:lineRule="auto"/>
+      </w:pPr>
+      <w:r>
+        <w:t xml:space="preserve">Configure </w:t>
       </w:r>
       <w:r>
         <w:rPr>
           <w:rStyle w:val="Strong"/>
         </w:rPr>
-        <w:t>not</w:t>
-      </w:r>
-      <w:r>
-        <w:t xml:space="preserve"> transition immediately to the forwarding state. </w:t>
+        <w:t>Root Guard on the HQ-S2 Port-Channel interface</w:t>
+      </w:r>
+      <w:r>
+        <w:t xml:space="preserve"> to protect the intended STP topology. </w:t>
       </w:r>
     </w:p>
     <w:p>
       <w:pPr>
         <w:numPr>
           <w:ilvl w:val="0"/>
-          <w:numId w:val="11"/>
+          <w:numId w:val="27"/>
         </w:numPr>
-        <w:spacing w:before="100" w:beforeAutospacing="1" w:after="100" w:afterAutospacing="1"/>
-      </w:pPr>
-      <w:r>
-        <w:t xml:space="preserve">Configure </w:t>
-      </w:r>
-      <w:r>
-        <w:rPr>
-          <w:rStyle w:val="Strong"/>
-        </w:rPr>
-        <w:t>BPDU Guard</w:t>
-      </w:r>
-      <w:r>
-        <w:t xml:space="preserve"> globally to protect all enterprise access ports. </w:t>
-      </w:r>
-    </w:p>
-    <w:p>
-      <w:pPr>
-        <w:numPr>
-          <w:ilvl w:val="0"/>
-          <w:numId w:val="11"/>
-        </w:numPr>
-        <w:spacing w:before="100" w:beforeAutospacing="1" w:after="100" w:afterAutospacing="1"/>
-      </w:pPr>
-      <w:r>
-        <w:t xml:space="preserve">Configure the enterprise switches so that non-access ports are </w:t>
-      </w:r>
-      <w:r>
-        <w:rPr>
-          <w:rStyle w:val="Strong"/>
-        </w:rPr>
-        <w:t>not</w:t>
-      </w:r>
-      <w:r>
-        <w:t xml:space="preserve"> affected by BPDU Guard. </w:t>
-      </w:r>
-    </w:p>
-    <w:p>
-      <w:pPr>
-        <w:numPr>
-          <w:ilvl w:val="0"/>
-          <w:numId w:val="11"/>
-        </w:numPr>
-        <w:spacing w:before="100" w:beforeAutospacing="1" w:after="100" w:afterAutospacing="1"/>
-      </w:pPr>
-      <w:r>
-        <w:t xml:space="preserve">Configure Root Guard on </w:t>
-      </w:r>
-      <w:r>
-        <w:rPr>
-          <w:rStyle w:val="Strong"/>
-        </w:rPr>
-        <w:t>HQ-S2 Port-Channel 1</w:t>
-      </w:r>
-      <w:r>
-        <w:t xml:space="preserve"> to prevent HQ-S1 from becoming the enterprise Root Bridge.</w:t>
-      </w:r>
-    </w:p>
-    <w:p>
-      <w:pPr>
-        <w:numPr>
-          <w:ilvl w:val="0"/>
-          <w:numId w:val="11"/>
-        </w:numPr>
-        <w:spacing w:before="100" w:beforeAutospacing="1" w:after="100" w:afterAutospacing="1"/>
-      </w:pPr>
-      <w:r>
-        <w:t xml:space="preserve">Verify that the enterprise spanning tree topology is operating as expected. </w:t>
-      </w:r>
-    </w:p>
-    <w:p>
-      <w:pPr>
-        <w:numPr>
-          <w:ilvl w:val="0"/>
-          <w:numId w:val="11"/>
-        </w:numPr>
-        <w:spacing w:before="100" w:beforeAutospacing="1" w:after="100" w:afterAutospacing="1"/>
-      </w:pPr>
-      <w:r>
-        <w:t>Troubleshoot and correct any STP configuration issues before proceeding.</w:t>
+        <w:spacing w:before="100" w:beforeAutospacing="1" w:after="100" w:afterAutospacing="1" w:line="276" w:lineRule="auto"/>
+      </w:pPr>
+      <w:r>
+        <w:lastRenderedPageBreak/>
+        <w:t xml:space="preserve">Ensure </w:t>
+      </w:r>
+      <w:proofErr w:type="spellStart"/>
+      <w:r>
+        <w:t>PortFast</w:t>
+      </w:r>
+      <w:proofErr w:type="spellEnd"/>
+      <w:r>
+        <w:t xml:space="preserve"> and BPDU Guard do not affect trunk or infrastructure links. </w:t>
       </w:r>
     </w:p>
     <w:p>
@@ -1535,14 +1443,7 @@
           <w:rStyle w:val="Strong"/>
           <w:b/>
         </w:rPr>
-        <w:t>:</w:t>
-      </w:r>
-      <w:r>
-        <w:rPr>
-          <w:rStyle w:val="Strong"/>
-          <w:b/>
-        </w:rPr>
-        <w:t xml:space="preserve"> </w:t>
+        <w:t xml:space="preserve">: </w:t>
       </w:r>
     </w:p>
     <w:p>
@@ -1638,7 +1539,6 @@
           <w:sz w:val="28"/>
           <w:szCs w:val="28"/>
         </w:rPr>
-        <w:lastRenderedPageBreak/>
         <w:t>HQ-</w:t>
       </w:r>
       <w:proofErr w:type="gramStart"/>
@@ -1680,6 +1580,355 @@
     </w:p>
     <w:p>
       <w:pPr>
+        <w:pStyle w:val="NormalWeb"/>
+      </w:pPr>
+      <w:r>
+        <w:rPr>
+          <w:rStyle w:val="Strong"/>
+        </w:rPr>
+        <w:t>Remote Sites – TUC-S3 and FLG-S4</w:t>
+      </w:r>
+    </w:p>
+    <w:p>
+      <w:pPr>
+        <w:numPr>
+          <w:ilvl w:val="0"/>
+          <w:numId w:val="28"/>
+        </w:numPr>
+        <w:spacing w:before="100" w:beforeAutospacing="1" w:after="100" w:afterAutospacing="1" w:line="276" w:lineRule="auto"/>
+      </w:pPr>
+      <w:r>
+        <w:t xml:space="preserve">Configure </w:t>
+      </w:r>
+      <w:proofErr w:type="spellStart"/>
+      <w:r>
+        <w:rPr>
+          <w:rStyle w:val="Strong"/>
+        </w:rPr>
+        <w:t>PortFast</w:t>
+      </w:r>
+      <w:proofErr w:type="spellEnd"/>
+      <w:r>
+        <w:rPr>
+          <w:rStyle w:val="Strong"/>
+        </w:rPr>
+        <w:t xml:space="preserve"> globally</w:t>
+      </w:r>
+      <w:r>
+        <w:t xml:space="preserve"> so that end-device access ports immediately transition to the forwarding state. </w:t>
+      </w:r>
+    </w:p>
+    <w:p>
+      <w:pPr>
+        <w:numPr>
+          <w:ilvl w:val="0"/>
+          <w:numId w:val="28"/>
+        </w:numPr>
+        <w:spacing w:before="100" w:beforeAutospacing="1" w:after="100" w:afterAutospacing="1" w:line="276" w:lineRule="auto"/>
+      </w:pPr>
+      <w:r>
+        <w:t xml:space="preserve">Configure </w:t>
+      </w:r>
+      <w:r>
+        <w:rPr>
+          <w:rStyle w:val="Strong"/>
+        </w:rPr>
+        <w:t>BPDU Guard globally</w:t>
+      </w:r>
+      <w:r>
+        <w:t xml:space="preserve"> to protect </w:t>
+      </w:r>
+      <w:proofErr w:type="spellStart"/>
+      <w:r>
+        <w:t>PortFast</w:t>
+      </w:r>
+      <w:proofErr w:type="spellEnd"/>
+      <w:r>
+        <w:t xml:space="preserve">-enabled access ports. </w:t>
+      </w:r>
+    </w:p>
+    <w:p>
+      <w:pPr>
+        <w:numPr>
+          <w:ilvl w:val="0"/>
+          <w:numId w:val="28"/>
+        </w:numPr>
+        <w:spacing w:before="100" w:beforeAutospacing="1" w:after="100" w:afterAutospacing="1" w:line="276" w:lineRule="auto"/>
+      </w:pPr>
+      <w:r>
+        <w:t xml:space="preserve">Because the </w:t>
+      </w:r>
+      <w:r>
+        <w:rPr>
+          <w:rStyle w:val="Strong"/>
+        </w:rPr>
+        <w:t>G0/1 router uplinks operate as VLAN 1 access links</w:t>
+      </w:r>
+      <w:r>
+        <w:t xml:space="preserve">, explicitly disable </w:t>
+      </w:r>
+      <w:proofErr w:type="spellStart"/>
+      <w:r>
+        <w:t>PortFast</w:t>
+      </w:r>
+      <w:proofErr w:type="spellEnd"/>
+      <w:r>
+        <w:t xml:space="preserve"> and BPDU Guard on </w:t>
+      </w:r>
+      <w:r>
+        <w:rPr>
+          <w:rStyle w:val="Strong"/>
+        </w:rPr>
+        <w:t>TUC-S3 G0/1</w:t>
+      </w:r>
+      <w:r>
+        <w:t xml:space="preserve"> and </w:t>
+      </w:r>
+      <w:r>
+        <w:rPr>
+          <w:rStyle w:val="Strong"/>
+        </w:rPr>
+        <w:t>FLG-S4 G0/1</w:t>
+      </w:r>
+      <w:r>
+        <w:t xml:space="preserve"> after applying the global settings. </w:t>
+      </w:r>
+    </w:p>
+    <w:p>
+      <w:pPr>
+        <w:spacing w:line="276" w:lineRule="auto"/>
+        <w:ind w:left="1440"/>
+        <w:rPr>
+          <w:rFonts w:ascii="Courier New" w:hAnsi="Courier New" w:cs="Courier New"/>
+        </w:rPr>
+      </w:pPr>
+      <w:proofErr w:type="gramStart"/>
+      <w:r>
+        <w:rPr>
+          <w:rFonts w:ascii="Courier New" w:hAnsi="Courier New" w:cs="Courier New"/>
+        </w:rPr>
+        <w:t>interface</w:t>
+      </w:r>
+      <w:proofErr w:type="gramEnd"/>
+      <w:r>
+        <w:rPr>
+          <w:rFonts w:ascii="Courier New" w:hAnsi="Courier New" w:cs="Courier New"/>
+        </w:rPr>
+        <w:t xml:space="preserve"> g0/1</w:t>
+      </w:r>
+    </w:p>
+    <w:p>
+      <w:pPr>
+        <w:spacing w:line="276" w:lineRule="auto"/>
+        <w:ind w:left="1440"/>
+        <w:rPr>
+          <w:rFonts w:ascii="Courier New" w:hAnsi="Courier New" w:cs="Courier New"/>
+        </w:rPr>
+      </w:pPr>
+      <w:r>
+        <w:rPr>
+          <w:rFonts w:ascii="Courier New" w:hAnsi="Courier New" w:cs="Courier New"/>
+        </w:rPr>
+        <w:t xml:space="preserve"> </w:t>
+      </w:r>
+      <w:proofErr w:type="gramStart"/>
+      <w:r>
+        <w:rPr>
+          <w:rFonts w:ascii="Courier New" w:hAnsi="Courier New" w:cs="Courier New"/>
+        </w:rPr>
+        <w:t>spanning-tree</w:t>
+      </w:r>
+      <w:proofErr w:type="gramEnd"/>
+      <w:r>
+        <w:rPr>
+          <w:rFonts w:ascii="Courier New" w:hAnsi="Courier New" w:cs="Courier New"/>
+        </w:rPr>
+        <w:t xml:space="preserve"> </w:t>
+      </w:r>
+      <w:proofErr w:type="spellStart"/>
+      <w:r>
+        <w:rPr>
+          <w:rFonts w:ascii="Courier New" w:hAnsi="Courier New" w:cs="Courier New"/>
+        </w:rPr>
+        <w:t>portfast</w:t>
+      </w:r>
+      <w:proofErr w:type="spellEnd"/>
+      <w:r>
+        <w:rPr>
+          <w:rFonts w:ascii="Courier New" w:hAnsi="Courier New" w:cs="Courier New"/>
+        </w:rPr>
+        <w:t xml:space="preserve"> disable</w:t>
+      </w:r>
+    </w:p>
+    <w:p>
+      <w:pPr>
+        <w:spacing w:line="276" w:lineRule="auto"/>
+        <w:ind w:left="1440"/>
+        <w:rPr>
+          <w:rFonts w:ascii="Courier New" w:hAnsi="Courier New" w:cs="Courier New"/>
+        </w:rPr>
+      </w:pPr>
+      <w:r>
+        <w:rPr>
+          <w:rFonts w:ascii="Courier New" w:hAnsi="Courier New" w:cs="Courier New"/>
+        </w:rPr>
+        <w:t xml:space="preserve"> </w:t>
+      </w:r>
+      <w:proofErr w:type="gramStart"/>
+      <w:r>
+        <w:rPr>
+          <w:rFonts w:ascii="Courier New" w:hAnsi="Courier New" w:cs="Courier New"/>
+        </w:rPr>
+        <w:t>spanning-tree</w:t>
+      </w:r>
+      <w:proofErr w:type="gramEnd"/>
+      <w:r>
+        <w:rPr>
+          <w:rFonts w:ascii="Courier New" w:hAnsi="Courier New" w:cs="Courier New"/>
+        </w:rPr>
+        <w:t xml:space="preserve"> </w:t>
+      </w:r>
+      <w:proofErr w:type="spellStart"/>
+      <w:r>
+        <w:rPr>
+          <w:rFonts w:ascii="Courier New" w:hAnsi="Courier New" w:cs="Courier New"/>
+        </w:rPr>
+        <w:t>bpduguard</w:t>
+      </w:r>
+      <w:proofErr w:type="spellEnd"/>
+      <w:r>
+        <w:rPr>
+          <w:rFonts w:ascii="Courier New" w:hAnsi="Courier New" w:cs="Courier New"/>
+        </w:rPr>
+        <w:t xml:space="preserve"> disable</w:t>
+      </w:r>
+    </w:p>
+    <w:p>
+      <w:pPr>
+        <w:numPr>
+          <w:ilvl w:val="0"/>
+          <w:numId w:val="28"/>
+        </w:numPr>
+        <w:spacing w:before="100" w:beforeAutospacing="1" w:after="100" w:afterAutospacing="1" w:line="276" w:lineRule="auto"/>
+      </w:pPr>
+      <w:r>
+        <w:t xml:space="preserve">Verify that </w:t>
+      </w:r>
+      <w:proofErr w:type="spellStart"/>
+      <w:r>
+        <w:t>PortFast</w:t>
+      </w:r>
+      <w:proofErr w:type="spellEnd"/>
+      <w:r>
+        <w:t xml:space="preserve"> and BPDU Guard remain active on the designated end-device access ports.</w:t>
+      </w:r>
+    </w:p>
+    <w:p>
+      <w:pPr>
+        <w:pStyle w:val="Heading4"/>
+        <w:rPr>
+          <w:color w:val="auto"/>
+          <w:sz w:val="24"/>
+          <w:szCs w:val="24"/>
+        </w:rPr>
+      </w:pPr>
+      <w:r>
+        <w:rPr>
+          <w:rStyle w:val="Strong"/>
+          <w:b/>
+          <w:bCs/>
+          <w:color w:val="auto"/>
+          <w:sz w:val="24"/>
+          <w:szCs w:val="24"/>
+        </w:rPr>
+        <w:t>Verification</w:t>
+      </w:r>
+    </w:p>
+    <w:p>
+      <w:pPr>
+        <w:numPr>
+          <w:ilvl w:val="0"/>
+          <w:numId w:val="29"/>
+        </w:numPr>
+        <w:spacing w:before="100" w:beforeAutospacing="1" w:after="100" w:afterAutospacing="1" w:line="276" w:lineRule="auto"/>
+      </w:pPr>
+      <w:r>
+        <w:t xml:space="preserve">Verify the STP configuration and confirm that </w:t>
+      </w:r>
+      <w:r>
+        <w:rPr>
+          <w:rStyle w:val="Strong"/>
+        </w:rPr>
+        <w:t>HQ-S2 is operating as the Root Bridge</w:t>
+      </w:r>
+      <w:r>
+        <w:t xml:space="preserve"> for the required VLANs. </w:t>
+      </w:r>
+    </w:p>
+    <w:p>
+      <w:pPr>
+        <w:numPr>
+          <w:ilvl w:val="0"/>
+          <w:numId w:val="29"/>
+        </w:numPr>
+        <w:spacing w:before="100" w:beforeAutospacing="1" w:after="100" w:afterAutospacing="1" w:line="276" w:lineRule="auto"/>
+      </w:pPr>
+      <w:r>
+        <w:t xml:space="preserve">Verify that </w:t>
+      </w:r>
+      <w:r>
+        <w:rPr>
+          <w:rStyle w:val="Strong"/>
+        </w:rPr>
+        <w:t>Root Guard</w:t>
+      </w:r>
+      <w:r>
+        <w:t xml:space="preserve"> is correctly configured on the HQ-S2 Port-Channel interface. </w:t>
+      </w:r>
+    </w:p>
+    <w:p>
+      <w:pPr>
+        <w:numPr>
+          <w:ilvl w:val="0"/>
+          <w:numId w:val="29"/>
+        </w:numPr>
+        <w:spacing w:before="100" w:beforeAutospacing="1" w:after="100" w:afterAutospacing="1" w:line="276" w:lineRule="auto"/>
+      </w:pPr>
+      <w:r>
+        <w:t xml:space="preserve">Verify that </w:t>
+      </w:r>
+      <w:proofErr w:type="spellStart"/>
+      <w:r>
+        <w:rPr>
+          <w:rStyle w:val="Strong"/>
+        </w:rPr>
+        <w:t>PortFast</w:t>
+      </w:r>
+      <w:proofErr w:type="spellEnd"/>
+      <w:r>
+        <w:rPr>
+          <w:rStyle w:val="Strong"/>
+        </w:rPr>
+        <w:t xml:space="preserve"> and BPDU Guard</w:t>
+      </w:r>
+      <w:r>
+        <w:t xml:space="preserve"> are operating as intended on enterprise end-device access ports and are not applied to infrastructure links. </w:t>
+      </w:r>
+    </w:p>
+    <w:p>
+      <w:pPr>
+        <w:numPr>
+          <w:ilvl w:val="0"/>
+          <w:numId w:val="29"/>
+        </w:numPr>
+        <w:spacing w:before="100" w:beforeAutospacing="1" w:after="100" w:afterAutospacing="1" w:line="276" w:lineRule="auto"/>
+      </w:pPr>
+      <w:r>
+        <w:t>Troubleshoot and correct any STP configuration issues before proceeding.</w:t>
+      </w:r>
+    </w:p>
+    <w:p>
+      <w:pPr>
         <w:spacing w:before="100" w:beforeAutospacing="1" w:after="100" w:afterAutospacing="1"/>
       </w:pPr>
       <w:r>
@@ -1696,6 +1945,7 @@
         <w:pStyle w:val="Heading3"/>
       </w:pPr>
       <w:r>
+        <w:lastRenderedPageBreak/>
         <w:t xml:space="preserve">Phase 3 – </w:t>
       </w:r>
       <w:r>
@@ -1730,10 +1980,25 @@
     </w:p>
     <w:p>
       <w:pPr>
-        <w:spacing w:before="100" w:beforeAutospacing="1" w:after="100" w:afterAutospacing="1"/>
-      </w:pPr>
-      <w:r>
-        <w:t>As part of the enterprise access layer hardening initiative, the Network Engineering Department has approved the implementation of standardized port security across the enterprise switching infrastructure. Port Security helps prevent unauthorized devices from connecting to the enterprise network while allowing approved end devices to maintain normal network access. In addition, unused switch ports will be secured to reduce the organization's attack surface and maintain compliance with the Enterprise Network Standards Guide.</w:t>
+        <w:pStyle w:val="pdq2pgselectionanchorcontainer"/>
+      </w:pPr>
+      <w:r>
+        <w:t>As part of the enterprise access layer hardening initiative, the Network Engineering Department has approved the implementation of standardized port security across the enterprise switching infrastructure. Port Security helps prevent unauthorized devices from connecting to the enterprise network while allowing approved end devices to maintain normal network access.</w:t>
+      </w:r>
+    </w:p>
+    <w:p>
+      <w:pPr>
+        <w:pStyle w:val="NormalWeb"/>
+        <w:rPr>
+          <w:b/>
+        </w:rPr>
+      </w:pPr>
+      <w:r>
+        <w:rPr>
+          <w:rStyle w:val="Strong"/>
+          <w:b w:val="0"/>
+        </w:rPr>
+        <w:t>During the initial enterprise deployment in ECR-001, unused and reserved switch ports were secured according to the Enterprise Network Standards Guide. Unused ports were assigned to the enterprise Parking Lot VLAN (VLAN 999) and administratively shut down, while reserved ports were administratively shut down until needed for an approved future implementation. This phase builds upon those existing security measures by implementing Port Security on active enterprise access ports.</w:t>
       </w:r>
     </w:p>
     <w:p>
@@ -1807,20 +2072,42 @@
           <w:ilvl w:val="0"/>
           <w:numId w:val="7"/>
         </w:numPr>
-        <w:spacing w:before="100" w:beforeAutospacing="1" w:after="100" w:afterAutospacing="1"/>
-      </w:pPr>
-      <w:r>
-        <w:t xml:space="preserve">Configure </w:t>
-      </w:r>
-      <w:r>
-        <w:rPr>
-          <w:b/>
-          <w:bCs/>
-        </w:rPr>
-        <w:t>Port Security</w:t>
-      </w:r>
-      <w:r>
-        <w:t xml:space="preserve"> on all designated enterprise access ports. </w:t>
+        <w:spacing w:before="100" w:beforeAutospacing="1" w:after="100" w:afterAutospacing="1" w:line="276" w:lineRule="auto"/>
+      </w:pPr>
+      <w:r>
+        <w:rPr>
+          <w:rStyle w:val="Strong"/>
+        </w:rPr>
+        <w:t xml:space="preserve">On TUC-S3 and FLG-S4, </w:t>
+      </w:r>
+      <w:r>
+        <w:rPr>
+          <w:rStyle w:val="Strong"/>
+          <w:b w:val="0"/>
+        </w:rPr>
+        <w:t>configure the designated end-device interfaces as</w:t>
+      </w:r>
+      <w:r>
+        <w:rPr>
+          <w:rStyle w:val="Strong"/>
+        </w:rPr>
+        <w:t xml:space="preserve"> static access ports </w:t>
+      </w:r>
+      <w:r>
+        <w:rPr>
+          <w:rStyle w:val="Strong"/>
+          <w:b w:val="0"/>
+        </w:rPr>
+        <w:t>before enabling</w:t>
+      </w:r>
+      <w:r>
+        <w:rPr>
+          <w:rStyle w:val="Strong"/>
+        </w:rPr>
+        <w:t xml:space="preserve"> Port Security.</w:t>
+      </w:r>
+      <w:r>
+        <w:t xml:space="preserve"> The designated Phoenix Headquarters end-device interfaces were configured as static access ports during the initial enterprise deployment and do not require this additional step.</w:t>
       </w:r>
     </w:p>
     <w:p>
@@ -1829,20 +2116,20 @@
           <w:ilvl w:val="0"/>
           <w:numId w:val="7"/>
         </w:numPr>
-        <w:spacing w:before="100" w:beforeAutospacing="1" w:after="100" w:afterAutospacing="1"/>
-      </w:pPr>
-      <w:r>
-        <w:t xml:space="preserve">Configure each access port to allow a maximum of </w:t>
+        <w:spacing w:before="100" w:beforeAutospacing="1" w:after="100" w:afterAutospacing="1" w:line="276" w:lineRule="auto"/>
+      </w:pPr>
+      <w:r>
+        <w:t xml:space="preserve">Configure </w:t>
       </w:r>
       <w:r>
         <w:rPr>
           <w:b/>
           <w:bCs/>
         </w:rPr>
-        <w:t>two secure MAC addresses</w:t>
-      </w:r>
-      <w:r>
-        <w:t xml:space="preserve">. </w:t>
+        <w:t>Port Security</w:t>
+      </w:r>
+      <w:r>
+        <w:t xml:space="preserve"> on all designated enterprise access ports. </w:t>
       </w:r>
     </w:p>
     <w:p>
@@ -1851,20 +2138,20 @@
           <w:ilvl w:val="0"/>
           <w:numId w:val="7"/>
         </w:numPr>
-        <w:spacing w:before="100" w:beforeAutospacing="1" w:after="100" w:afterAutospacing="1"/>
-      </w:pPr>
-      <w:r>
-        <w:t xml:space="preserve">Configure </w:t>
+        <w:spacing w:before="100" w:beforeAutospacing="1" w:after="100" w:afterAutospacing="1" w:line="276" w:lineRule="auto"/>
+      </w:pPr>
+      <w:r>
+        <w:t xml:space="preserve">Configure each access port to allow a maximum of </w:t>
       </w:r>
       <w:r>
         <w:rPr>
           <w:b/>
           <w:bCs/>
         </w:rPr>
-        <w:t>Sticky MAC Addressing</w:t>
-      </w:r>
-      <w:r>
-        <w:t xml:space="preserve"> so that dynamically learned MAC addresses are added to the running configuration. </w:t>
+        <w:t>two secure MAC addresses</w:t>
+      </w:r>
+      <w:r>
+        <w:t xml:space="preserve">. </w:t>
       </w:r>
     </w:p>
     <w:p>
@@ -1873,22 +2160,20 @@
           <w:ilvl w:val="0"/>
           <w:numId w:val="7"/>
         </w:numPr>
-        <w:spacing w:before="100" w:beforeAutospacing="1" w:after="100" w:afterAutospacing="1"/>
-      </w:pPr>
-      <w:r>
-        <w:t xml:space="preserve">Configure the Port Security violation mode to </w:t>
-      </w:r>
-      <w:proofErr w:type="spellStart"/>
+        <w:spacing w:before="100" w:beforeAutospacing="1" w:after="100" w:afterAutospacing="1" w:line="276" w:lineRule="auto"/>
+      </w:pPr>
+      <w:r>
+        <w:t xml:space="preserve">Configure </w:t>
+      </w:r>
       <w:r>
         <w:rPr>
           <w:b/>
           <w:bCs/>
         </w:rPr>
-        <w:t>shutdown</w:t>
-      </w:r>
-      <w:proofErr w:type="spellEnd"/>
-      <w:r>
-        <w:t xml:space="preserve">. </w:t>
+        <w:t>Sticky MAC Addressing</w:t>
+      </w:r>
+      <w:r>
+        <w:t xml:space="preserve"> so that dynamically learned MAC addresses are added to the running configuration. </w:t>
       </w:r>
     </w:p>
     <w:p>
@@ -1897,10 +2182,22 @@
           <w:ilvl w:val="0"/>
           <w:numId w:val="7"/>
         </w:numPr>
-        <w:spacing w:before="100" w:beforeAutospacing="1" w:after="100" w:afterAutospacing="1"/>
-      </w:pPr>
-      <w:r>
-        <w:t xml:space="preserve">Verify that Port Security is operating correctly on all designated access ports. </w:t>
+        <w:spacing w:before="100" w:beforeAutospacing="1" w:after="100" w:afterAutospacing="1" w:line="276" w:lineRule="auto"/>
+      </w:pPr>
+      <w:r>
+        <w:t xml:space="preserve">Configure the Port Security violation mode to </w:t>
+      </w:r>
+      <w:proofErr w:type="spellStart"/>
+      <w:r>
+        <w:rPr>
+          <w:b/>
+          <w:bCs/>
+        </w:rPr>
+        <w:t>shutdown</w:t>
+      </w:r>
+      <w:proofErr w:type="spellEnd"/>
+      <w:r>
+        <w:t xml:space="preserve">. </w:t>
       </w:r>
     </w:p>
     <w:p>
@@ -1909,20 +2206,10 @@
           <w:ilvl w:val="0"/>
           <w:numId w:val="7"/>
         </w:numPr>
-        <w:spacing w:before="100" w:beforeAutospacing="1" w:after="100" w:afterAutospacing="1"/>
-      </w:pPr>
-      <w:r>
-        <w:t xml:space="preserve">Assign all unused switch ports to the enterprise </w:t>
-      </w:r>
-      <w:r>
-        <w:rPr>
-          <w:b/>
-          <w:bCs/>
-        </w:rPr>
-        <w:t>Parking Lot VLAN (VLAN 999)</w:t>
-      </w:r>
-      <w:r>
-        <w:t xml:space="preserve">. </w:t>
+        <w:spacing w:before="100" w:beforeAutospacing="1" w:after="100" w:afterAutospacing="1" w:line="276" w:lineRule="auto"/>
+      </w:pPr>
+      <w:r>
+        <w:t xml:space="preserve">Verify that Port Security is operating correctly on all designated access ports. </w:t>
       </w:r>
     </w:p>
     <w:p>
@@ -1931,41 +2218,7 @@
           <w:ilvl w:val="0"/>
           <w:numId w:val="7"/>
         </w:numPr>
-        <w:spacing w:before="100" w:beforeAutospacing="1" w:after="100" w:afterAutospacing="1"/>
-      </w:pPr>
-      <w:r>
-        <w:t xml:space="preserve">Administratively </w:t>
-      </w:r>
-      <w:r>
-        <w:rPr>
-          <w:b/>
-          <w:bCs/>
-        </w:rPr>
-        <w:t>shut down</w:t>
-      </w:r>
-      <w:r>
-        <w:t xml:space="preserve"> all unused switch ports. </w:t>
-      </w:r>
-    </w:p>
-    <w:p>
-      <w:pPr>
-        <w:numPr>
-          <w:ilvl w:val="0"/>
-          <w:numId w:val="7"/>
-        </w:numPr>
-        <w:spacing w:before="100" w:beforeAutospacing="1" w:after="100" w:afterAutospacing="1"/>
-      </w:pPr>
-      <w:r>
-        <w:t xml:space="preserve">Update interface descriptions as needed according to the Enterprise Network Standards Guide and the Lab Process &amp; Expectations Guide. </w:t>
-      </w:r>
-    </w:p>
-    <w:p>
-      <w:pPr>
-        <w:numPr>
-          <w:ilvl w:val="0"/>
-          <w:numId w:val="7"/>
-        </w:numPr>
-        <w:spacing w:before="100" w:beforeAutospacing="1" w:after="100" w:afterAutospacing="1"/>
+        <w:spacing w:before="100" w:beforeAutospacing="1" w:after="100" w:afterAutospacing="1" w:line="276" w:lineRule="auto"/>
       </w:pPr>
       <w:r>
         <w:t>Troubleshoot and correct any Port Security or access port configuration issues before proceeding.</w:t>
@@ -1997,6 +2250,7 @@
         <w:pStyle w:val="Heading4"/>
       </w:pPr>
       <w:r>
+        <w:lastRenderedPageBreak/>
         <w:t xml:space="preserve">Step 1: Configure </w:t>
       </w:r>
       <w:r>
@@ -2012,7 +2266,6 @@
           <w:b/>
           <w:bCs/>
         </w:rPr>
-        <w:lastRenderedPageBreak/>
         <w:t>Background</w:t>
       </w:r>
     </w:p>
@@ -2021,7 +2274,13 @@
         <w:spacing w:before="100" w:beforeAutospacing="1" w:after="100" w:afterAutospacing="1"/>
       </w:pPr>
       <w:r>
-        <w:t>To improve the security of the enterprise network infrastructure, the Network Engineering Department has approved the transition from unsecured remote management to Secure Shell (SSH). SSH provides encrypted remote administrative access to enterprise network devices, helping protect administrator credentials and management traffic from unauthorized interception. As part of this implementation, all enterprise switches will use standardized local authentication, encrypted communications, and secure remote management settings in accordance with the Enterprise Security Configuration Standards.</w:t>
+        <w:t xml:space="preserve">To improve the security of the enterprise network infrastructure, the Network Engineering Department has approved the transition from unsecured remote management to Secure Shell (SSH). SSH provides encrypted remote administrative access to enterprise network devices, helping protect administrator credentials and management traffic from unauthorized interception. As part of this implementation, all enterprise </w:t>
+      </w:r>
+      <w:r>
+        <w:t xml:space="preserve">routers and </w:t>
+      </w:r>
+      <w:r>
+        <w:t>switches will use standardized local authentication, encrypted communications, and secure remote management settings in accordance with the Enterprise Security Configuration Standards.</w:t>
       </w:r>
     </w:p>
     <w:p>
@@ -2135,7 +2394,7 @@
           <w:ilvl w:val="0"/>
           <w:numId w:val="12"/>
         </w:numPr>
-        <w:spacing w:before="100" w:beforeAutospacing="1" w:after="100" w:afterAutospacing="1"/>
+        <w:spacing w:before="100" w:beforeAutospacing="1" w:after="100" w:afterAutospacing="1" w:line="276" w:lineRule="auto"/>
       </w:pPr>
       <w:r>
         <w:t xml:space="preserve">Configure the local administrator account using the following enterprise standards: </w:t>
@@ -2147,7 +2406,7 @@
           <w:ilvl w:val="1"/>
           <w:numId w:val="12"/>
         </w:numPr>
-        <w:spacing w:before="100" w:beforeAutospacing="1" w:after="100" w:afterAutospacing="1"/>
+        <w:spacing w:before="100" w:beforeAutospacing="1" w:after="100" w:afterAutospacing="1" w:line="276" w:lineRule="auto"/>
       </w:pPr>
       <w:r>
         <w:t xml:space="preserve">Username: </w:t>
@@ -2169,7 +2428,7 @@
           <w:ilvl w:val="1"/>
           <w:numId w:val="12"/>
         </w:numPr>
-        <w:spacing w:before="100" w:beforeAutospacing="1" w:after="100" w:afterAutospacing="1"/>
+        <w:spacing w:before="100" w:beforeAutospacing="1" w:after="100" w:afterAutospacing="1" w:line="276" w:lineRule="auto"/>
       </w:pPr>
       <w:r>
         <w:t xml:space="preserve">Privilege Level: </w:t>
@@ -2191,7 +2450,7 @@
           <w:ilvl w:val="1"/>
           <w:numId w:val="12"/>
         </w:numPr>
-        <w:spacing w:before="100" w:beforeAutospacing="1" w:after="100" w:afterAutospacing="1"/>
+        <w:spacing w:before="100" w:beforeAutospacing="1" w:after="100" w:afterAutospacing="1" w:line="276" w:lineRule="auto"/>
       </w:pPr>
       <w:r>
         <w:t xml:space="preserve">Secret password: </w:t>
@@ -2213,7 +2472,7 @@
           <w:ilvl w:val="0"/>
           <w:numId w:val="12"/>
         </w:numPr>
-        <w:spacing w:before="100" w:beforeAutospacing="1" w:after="100" w:afterAutospacing="1"/>
+        <w:spacing w:before="100" w:beforeAutospacing="1" w:after="100" w:afterAutospacing="1" w:line="276" w:lineRule="auto"/>
       </w:pPr>
       <w:r>
         <w:t xml:space="preserve">Configure the enterprise domain name: </w:t>
@@ -2225,7 +2484,7 @@
           <w:ilvl w:val="1"/>
           <w:numId w:val="12"/>
         </w:numPr>
-        <w:spacing w:before="100" w:beforeAutospacing="1" w:after="100" w:afterAutospacing="1"/>
+        <w:spacing w:before="100" w:beforeAutospacing="1" w:after="100" w:afterAutospacing="1" w:line="276" w:lineRule="auto"/>
       </w:pPr>
       <w:r>
         <w:rPr>
@@ -2244,7 +2503,7 @@
           <w:ilvl w:val="0"/>
           <w:numId w:val="12"/>
         </w:numPr>
-        <w:spacing w:before="100" w:beforeAutospacing="1" w:after="100" w:afterAutospacing="1"/>
+        <w:spacing w:before="100" w:beforeAutospacing="1" w:after="100" w:afterAutospacing="1" w:line="276" w:lineRule="auto"/>
       </w:pPr>
       <w:r>
         <w:t xml:space="preserve">Generate </w:t>
@@ -2266,10 +2525,16 @@
           <w:ilvl w:val="0"/>
           <w:numId w:val="12"/>
         </w:numPr>
-        <w:spacing w:before="100" w:beforeAutospacing="1" w:after="100" w:afterAutospacing="1"/>
-      </w:pPr>
-      <w:r>
-        <w:t xml:space="preserve">Configure all enterprise switches to use </w:t>
+        <w:spacing w:before="100" w:beforeAutospacing="1" w:after="100" w:afterAutospacing="1" w:line="276" w:lineRule="auto"/>
+      </w:pPr>
+      <w:r>
+        <w:t xml:space="preserve">Configure all enterprise </w:t>
+      </w:r>
+      <w:r>
+        <w:t xml:space="preserve">routers and </w:t>
+      </w:r>
+      <w:r>
+        <w:t xml:space="preserve">switches to use </w:t>
       </w:r>
       <w:r>
         <w:rPr>
@@ -2288,7 +2553,7 @@
           <w:ilvl w:val="0"/>
           <w:numId w:val="12"/>
         </w:numPr>
-        <w:spacing w:before="100" w:beforeAutospacing="1" w:after="100" w:afterAutospacing="1"/>
+        <w:spacing w:before="100" w:beforeAutospacing="1" w:after="100" w:afterAutospacing="1" w:line="276" w:lineRule="auto"/>
       </w:pPr>
       <w:r>
         <w:t xml:space="preserve">Configure the VTY lines to: </w:t>
@@ -2300,7 +2565,7 @@
           <w:ilvl w:val="1"/>
           <w:numId w:val="12"/>
         </w:numPr>
-        <w:spacing w:before="100" w:beforeAutospacing="1" w:after="100" w:afterAutospacing="1"/>
+        <w:spacing w:before="100" w:beforeAutospacing="1" w:after="100" w:afterAutospacing="1" w:line="276" w:lineRule="auto"/>
       </w:pPr>
       <w:r>
         <w:t xml:space="preserve">Use </w:t>
@@ -2333,7 +2598,7 @@
           <w:ilvl w:val="1"/>
           <w:numId w:val="12"/>
         </w:numPr>
-        <w:spacing w:before="100" w:beforeAutospacing="1" w:after="100" w:afterAutospacing="1"/>
+        <w:spacing w:before="100" w:beforeAutospacing="1" w:after="100" w:afterAutospacing="1" w:line="276" w:lineRule="auto"/>
       </w:pPr>
       <w:r>
         <w:t xml:space="preserve">Accept </w:t>
@@ -2355,7 +2620,7 @@
           <w:ilvl w:val="1"/>
           <w:numId w:val="12"/>
         </w:numPr>
-        <w:spacing w:before="100" w:beforeAutospacing="1" w:after="100" w:afterAutospacing="1"/>
+        <w:spacing w:before="100" w:beforeAutospacing="1" w:after="100" w:afterAutospacing="1" w:line="276" w:lineRule="auto"/>
       </w:pPr>
       <w:r>
         <w:t xml:space="preserve">Disable </w:t>
@@ -2377,10 +2642,16 @@
           <w:ilvl w:val="0"/>
           <w:numId w:val="12"/>
         </w:numPr>
-        <w:spacing w:before="100" w:beforeAutospacing="1" w:after="100" w:afterAutospacing="1"/>
-      </w:pPr>
-      <w:r>
-        <w:t xml:space="preserve">Verify that secure remote management is functioning correctly by establishing an SSH connection to each enterprise switch. </w:t>
+        <w:spacing w:before="100" w:beforeAutospacing="1" w:after="100" w:afterAutospacing="1" w:line="276" w:lineRule="auto"/>
+      </w:pPr>
+      <w:r>
+        <w:t xml:space="preserve">Verify that secure remote management is functioning correctly by establishing an SSH connection to each enterprise </w:t>
+      </w:r>
+      <w:r>
+        <w:t xml:space="preserve">router and </w:t>
+      </w:r>
+      <w:r>
+        <w:t xml:space="preserve">switch. </w:t>
       </w:r>
     </w:p>
     <w:p>
@@ -2389,9 +2660,10 @@
           <w:ilvl w:val="0"/>
           <w:numId w:val="12"/>
         </w:numPr>
-        <w:spacing w:before="100" w:beforeAutospacing="1" w:after="100" w:afterAutospacing="1"/>
-      </w:pPr>
-      <w:r>
+        <w:spacing w:before="100" w:beforeAutospacing="1" w:after="100" w:afterAutospacing="1" w:line="276" w:lineRule="auto"/>
+      </w:pPr>
+      <w:r>
+        <w:lastRenderedPageBreak/>
         <w:t xml:space="preserve">During the initial SSH connection, verify and accept the remote device's SSH host key when prompted. </w:t>
       </w:r>
     </w:p>
@@ -2401,7 +2673,7 @@
           <w:ilvl w:val="0"/>
           <w:numId w:val="12"/>
         </w:numPr>
-        <w:spacing w:before="100" w:beforeAutospacing="1" w:after="100" w:afterAutospacing="1"/>
+        <w:spacing w:before="100" w:beforeAutospacing="1" w:after="100" w:afterAutospacing="1" w:line="276" w:lineRule="auto"/>
       </w:pPr>
       <w:r>
         <w:t xml:space="preserve">Troubleshoot and correct any SSH connectivity or authentication issues before proceeding. </w:t>
@@ -2413,10 +2685,9 @@
           <w:ilvl w:val="0"/>
           <w:numId w:val="12"/>
         </w:numPr>
-        <w:spacing w:before="100" w:beforeAutospacing="1" w:after="100" w:afterAutospacing="1"/>
-      </w:pPr>
-      <w:r>
-        <w:lastRenderedPageBreak/>
+        <w:spacing w:before="100" w:beforeAutospacing="1" w:after="100" w:afterAutospacing="1" w:line="276" w:lineRule="auto"/>
+      </w:pPr>
+      <w:r>
         <w:t>Save the running configuration after verifying SSH connectivity.</w:t>
       </w:r>
     </w:p>
@@ -2499,7 +2770,7 @@
           <w:ilvl w:val="0"/>
           <w:numId w:val="10"/>
         </w:numPr>
-        <w:spacing w:before="100" w:beforeAutospacing="1" w:after="100" w:afterAutospacing="1"/>
+        <w:spacing w:before="100" w:beforeAutospacing="1" w:after="100" w:afterAutospacing="1" w:line="276" w:lineRule="auto"/>
       </w:pPr>
       <w:r>
         <w:t xml:space="preserve">Include the </w:t>
@@ -2521,7 +2792,7 @@
           <w:ilvl w:val="0"/>
           <w:numId w:val="10"/>
         </w:numPr>
-        <w:spacing w:before="100" w:beforeAutospacing="1" w:after="100" w:afterAutospacing="1"/>
+        <w:spacing w:before="100" w:beforeAutospacing="1" w:after="100" w:afterAutospacing="1" w:line="276" w:lineRule="auto"/>
       </w:pPr>
       <w:r>
         <w:t xml:space="preserve">Ensure the </w:t>
@@ -2543,7 +2814,7 @@
           <w:ilvl w:val="0"/>
           <w:numId w:val="10"/>
         </w:numPr>
-        <w:spacing w:before="100" w:beforeAutospacing="1" w:after="100" w:afterAutospacing="1"/>
+        <w:spacing w:before="100" w:beforeAutospacing="1" w:after="100" w:afterAutospacing="1" w:line="276" w:lineRule="auto"/>
       </w:pPr>
       <w:r>
         <w:t xml:space="preserve">Include the complete command output or ping results. </w:t>
@@ -2555,7 +2826,7 @@
           <w:ilvl w:val="0"/>
           <w:numId w:val="10"/>
         </w:numPr>
-        <w:spacing w:before="100" w:beforeAutospacing="1" w:after="100" w:afterAutospacing="1"/>
+        <w:spacing w:before="100" w:beforeAutospacing="1" w:after="100" w:afterAutospacing="1" w:line="276" w:lineRule="auto"/>
       </w:pPr>
       <w:r>
         <w:t xml:space="preserve">If a required test is unsuccessful, include a screenshot of the failed test and record the result as </w:t>
@@ -2638,7 +2909,7 @@
           <w:ilvl w:val="0"/>
           <w:numId w:val="8"/>
         </w:numPr>
-        <w:spacing w:before="100" w:beforeAutospacing="1" w:after="100" w:afterAutospacing="1"/>
+        <w:spacing w:before="100" w:beforeAutospacing="1" w:after="100" w:afterAutospacing="1" w:line="276" w:lineRule="auto"/>
       </w:pPr>
       <w:r>
         <w:t>Perform and document both an IPv4 and an IPv6 ping</w:t>
@@ -2650,7 +2921,7 @@
           <w:ilvl w:val="0"/>
           <w:numId w:val="8"/>
         </w:numPr>
-        <w:spacing w:before="100" w:beforeAutospacing="1" w:after="100" w:afterAutospacing="1"/>
+        <w:spacing w:before="100" w:beforeAutospacing="1" w:after="100" w:afterAutospacing="1" w:line="276" w:lineRule="auto"/>
       </w:pPr>
       <w:r>
         <w:t xml:space="preserve">Include the </w:t>
@@ -2672,7 +2943,7 @@
           <w:ilvl w:val="0"/>
           <w:numId w:val="8"/>
         </w:numPr>
-        <w:spacing w:before="100" w:beforeAutospacing="1" w:after="100" w:afterAutospacing="1"/>
+        <w:spacing w:before="100" w:beforeAutospacing="1" w:after="100" w:afterAutospacing="1" w:line="276" w:lineRule="auto"/>
       </w:pPr>
       <w:r>
         <w:t xml:space="preserve">Include the successful ping results. </w:t>
@@ -2684,7 +2955,7 @@
           <w:ilvl w:val="0"/>
           <w:numId w:val="8"/>
         </w:numPr>
-        <w:spacing w:before="100" w:beforeAutospacing="1" w:after="100" w:afterAutospacing="1"/>
+        <w:spacing w:before="100" w:beforeAutospacing="1" w:after="100" w:afterAutospacing="1" w:line="276" w:lineRule="auto"/>
       </w:pPr>
       <w:r>
         <w:t xml:space="preserve">Ensure the destination </w:t>
@@ -2709,6 +2980,7 @@
           <w:rStyle w:val="Strong"/>
           <w:rFonts w:ascii="Segoe UI Symbol" w:hAnsi="Segoe UI Symbol" w:cs="Segoe UI Symbol"/>
         </w:rPr>
+        <w:lastRenderedPageBreak/>
         <w:t>⚠</w:t>
       </w:r>
       <w:r>
@@ -2759,15 +3031,7 @@
           <w:rStyle w:val="Strong"/>
           <w:b/>
         </w:rPr>
-        <w:t xml:space="preserve">IPv4 </w:t>
-      </w:r>
-      <w:r>
-        <w:rPr>
-          <w:rStyle w:val="Strong"/>
-          <w:b/>
-        </w:rPr>
-        <w:lastRenderedPageBreak/>
-        <w:t>and IPv6</w:t>
+        <w:t>IPv4 and IPv6</w:t>
       </w:r>
       <w:r>
         <w:rPr>
@@ -3032,7 +3296,7 @@
               <w:t xml:space="preserve"> </w:t>
             </w:r>
             <w:r>
-              <w:t>Human Resources</w:t>
+              <w:t>Phoenix PC-HR1</w:t>
             </w:r>
           </w:p>
         </w:tc>
@@ -3054,7 +3318,7 @@
               <w:t xml:space="preserve"> </w:t>
             </w:r>
             <w:r>
-              <w:t>Accounting &amp; Finance</w:t>
+              <w:t>Phoenix PC-AF1</w:t>
             </w:r>
           </w:p>
         </w:tc>
@@ -3089,7 +3353,7 @@
               <w:t xml:space="preserve"> </w:t>
             </w:r>
             <w:r>
-              <w:t>Human Resources</w:t>
+              <w:t>Phoenix PC-HR1</w:t>
             </w:r>
           </w:p>
         </w:tc>
@@ -3110,7 +3374,7 @@
               <w:t xml:space="preserve"> </w:t>
             </w:r>
             <w:r>
-              <w:t>Accounting &amp; Finance</w:t>
+              <w:t>Phoenix PC-AF1</w:t>
             </w:r>
           </w:p>
         </w:tc>
@@ -3144,7 +3408,7 @@
               <w:t xml:space="preserve"> </w:t>
             </w:r>
             <w:r>
-              <w:t>Sales &amp; Customer Service</w:t>
+              <w:t>Phoenix PC-SCS1</w:t>
             </w:r>
           </w:p>
         </w:tc>
@@ -3165,7 +3429,7 @@
               <w:t xml:space="preserve"> </w:t>
             </w:r>
             <w:r>
-              <w:t>Executive Administration</w:t>
+              <w:t>Phoenix PC-EX1</w:t>
             </w:r>
           </w:p>
         </w:tc>
@@ -3198,7 +3462,7 @@
               <w:t xml:space="preserve"> </w:t>
             </w:r>
             <w:r>
-              <w:t>Sales &amp; Customer Service</w:t>
+              <w:t>Phoenix PC-SCS1</w:t>
             </w:r>
           </w:p>
         </w:tc>
@@ -3209,10 +3473,16 @@
           </w:tcPr>
           <w:p>
             <w:r>
-              <w:t xml:space="preserve">IPv6 </w:t>
+              <w:rPr>
+                <w:b/>
+              </w:rPr>
+              <w:t>IPv6</w:t>
             </w:r>
             <w:r>
-              <w:t>Executive Administration</w:t>
+              <w:t xml:space="preserve"> </w:t>
+            </w:r>
+            <w:r>
+              <w:t>Phoenix PC-EX1</w:t>
             </w:r>
           </w:p>
         </w:tc>
@@ -3243,7 +3513,10 @@
               <w:t>IPv4</w:t>
             </w:r>
             <w:r>
-              <w:t xml:space="preserve"> Information Technology</w:t>
+              <w:t xml:space="preserve"> </w:t>
+            </w:r>
+            <w:r>
+              <w:t xml:space="preserve">Phoenix PC-IT1 </w:t>
             </w:r>
           </w:p>
         </w:tc>
@@ -3265,7 +3538,7 @@
               <w:t xml:space="preserve"> </w:t>
             </w:r>
             <w:r>
-              <w:t>Executive Administration</w:t>
+              <w:t>Phoenix PC-EX1</w:t>
             </w:r>
           </w:p>
         </w:tc>
@@ -3297,7 +3570,10 @@
               <w:t>IPv6</w:t>
             </w:r>
             <w:r>
-              <w:t xml:space="preserve"> Information Technology</w:t>
+              <w:t xml:space="preserve"> </w:t>
+            </w:r>
+            <w:r>
+              <w:t>Phoenix PC-IT1</w:t>
             </w:r>
           </w:p>
         </w:tc>
@@ -3318,7 +3594,7 @@
               <w:t xml:space="preserve"> </w:t>
             </w:r>
             <w:r>
-              <w:t>Executive Administration</w:t>
+              <w:t>Phoenix PC-EX1</w:t>
             </w:r>
           </w:p>
         </w:tc>
@@ -3345,6 +3621,7 @@
         <w:pStyle w:val="Heading4"/>
       </w:pPr>
       <w:r>
+        <w:lastRenderedPageBreak/>
         <w:t xml:space="preserve">Step </w:t>
       </w:r>
       <w:r>
@@ -3397,22 +3674,15 @@
     </w:p>
     <w:p>
       <w:pPr>
+        <w:pStyle w:val="ListParagraph"/>
+        <w:numPr>
+          <w:ilvl w:val="0"/>
+          <w:numId w:val="8"/>
+        </w:numPr>
         <w:spacing w:line="276" w:lineRule="auto"/>
-        <w:ind w:left="720"/>
-      </w:pPr>
-      <w:proofErr w:type="gramStart"/>
-      <w:r>
-        <w:rPr>
-          <w:rFonts w:hAnsi="Symbol"/>
-        </w:rPr>
-        <w:t></w:t>
-      </w:r>
-      <w:r>
-        <w:t xml:space="preserve">  Establish</w:t>
-      </w:r>
-      <w:proofErr w:type="gramEnd"/>
-      <w:r>
-        <w:t xml:space="preserve"> a successful SSH connection to each enterprise router and switch using its </w:t>
+      </w:pPr>
+      <w:r>
+        <w:t xml:space="preserve">Establish a successful SSH connection to each enterprise router and switch using its </w:t>
       </w:r>
       <w:r>
         <w:rPr>
@@ -3427,22 +3697,15 @@
     </w:p>
     <w:p>
       <w:pPr>
+        <w:pStyle w:val="ListParagraph"/>
+        <w:numPr>
+          <w:ilvl w:val="0"/>
+          <w:numId w:val="8"/>
+        </w:numPr>
         <w:spacing w:line="276" w:lineRule="auto"/>
-        <w:ind w:left="720"/>
-      </w:pPr>
-      <w:proofErr w:type="gramStart"/>
-      <w:r>
-        <w:rPr>
-          <w:rFonts w:hAnsi="Symbol"/>
-        </w:rPr>
-        <w:t></w:t>
-      </w:r>
-      <w:r>
-        <w:t xml:space="preserve">  Establish</w:t>
-      </w:r>
-      <w:proofErr w:type="gramEnd"/>
-      <w:r>
-        <w:t xml:space="preserve"> a successful SSH connection to each enterprise router and switch using its </w:t>
+      </w:pPr>
+      <w:r>
+        <w:t xml:space="preserve">Establish a successful SSH connection to each enterprise router and switch using its </w:t>
       </w:r>
       <w:r>
         <w:rPr>
@@ -3457,82 +3720,54 @@
     </w:p>
     <w:p>
       <w:pPr>
+        <w:pStyle w:val="ListParagraph"/>
+        <w:numPr>
+          <w:ilvl w:val="0"/>
+          <w:numId w:val="8"/>
+        </w:numPr>
         <w:spacing w:line="276" w:lineRule="auto"/>
-        <w:ind w:left="720"/>
-      </w:pPr>
-      <w:proofErr w:type="gramStart"/>
-      <w:r>
-        <w:rPr>
-          <w:rFonts w:hAnsi="Symbol"/>
-        </w:rPr>
-        <w:t></w:t>
-      </w:r>
-      <w:r>
-        <w:t xml:space="preserve">  Include</w:t>
-      </w:r>
-      <w:proofErr w:type="gramEnd"/>
-      <w:r>
-        <w:t xml:space="preserve"> the source device initiating the SSH session. </w:t>
-      </w:r>
-    </w:p>
-    <w:p>
-      <w:pPr>
+      </w:pPr>
+      <w:r>
+        <w:t xml:space="preserve">Include the source device initiating the SSH session. </w:t>
+      </w:r>
+    </w:p>
+    <w:p>
+      <w:pPr>
+        <w:pStyle w:val="ListParagraph"/>
+        <w:numPr>
+          <w:ilvl w:val="0"/>
+          <w:numId w:val="8"/>
+        </w:numPr>
         <w:spacing w:line="276" w:lineRule="auto"/>
-        <w:ind w:left="720"/>
-      </w:pPr>
-      <w:proofErr w:type="gramStart"/>
-      <w:r>
-        <w:rPr>
-          <w:rFonts w:hAnsi="Symbol"/>
-        </w:rPr>
-        <w:t></w:t>
-      </w:r>
-      <w:r>
-        <w:t xml:space="preserve">  Include</w:t>
-      </w:r>
-      <w:proofErr w:type="gramEnd"/>
-      <w:r>
-        <w:t xml:space="preserve"> the successful SSH login. </w:t>
-      </w:r>
-    </w:p>
-    <w:p>
-      <w:pPr>
+      </w:pPr>
+      <w:r>
+        <w:t xml:space="preserve">Include the successful SSH login. </w:t>
+      </w:r>
+    </w:p>
+    <w:p>
+      <w:pPr>
+        <w:pStyle w:val="ListParagraph"/>
+        <w:numPr>
+          <w:ilvl w:val="0"/>
+          <w:numId w:val="8"/>
+        </w:numPr>
         <w:spacing w:line="276" w:lineRule="auto"/>
-        <w:ind w:left="720"/>
-      </w:pPr>
-      <w:proofErr w:type="gramStart"/>
-      <w:r>
-        <w:rPr>
-          <w:rFonts w:hAnsi="Symbol"/>
-        </w:rPr>
-        <w:t></w:t>
-      </w:r>
-      <w:r>
-        <w:t xml:space="preserve">  Ensure</w:t>
-      </w:r>
-      <w:proofErr w:type="gramEnd"/>
-      <w:r>
-        <w:t xml:space="preserve"> the destination device is clearly identified. </w:t>
-      </w:r>
-    </w:p>
-    <w:p>
-      <w:pPr>
+      </w:pPr>
+      <w:r>
+        <w:t xml:space="preserve">Ensure the destination device is clearly identified. </w:t>
+      </w:r>
+    </w:p>
+    <w:p>
+      <w:pPr>
+        <w:pStyle w:val="ListParagraph"/>
+        <w:numPr>
+          <w:ilvl w:val="0"/>
+          <w:numId w:val="8"/>
+        </w:numPr>
         <w:spacing w:line="276" w:lineRule="auto"/>
-        <w:ind w:left="720"/>
-      </w:pPr>
-      <w:proofErr w:type="gramStart"/>
-      <w:r>
-        <w:rPr>
-          <w:rFonts w:hAnsi="Symbol"/>
-        </w:rPr>
-        <w:t></w:t>
-      </w:r>
-      <w:r>
-        <w:t xml:space="preserve">  During</w:t>
-      </w:r>
-      <w:proofErr w:type="gramEnd"/>
-      <w:r>
-        <w:t xml:space="preserve"> the initial SSH connection, verify and accept the SSH host key if prompted.</w:t>
+      </w:pPr>
+      <w:r>
+        <w:t>During the initial SSH connection, verify and accept the SSH host key if prompted.</w:t>
       </w:r>
     </w:p>
     <w:p>
@@ -3809,6 +4044,7 @@
               <w:rPr>
                 <w:b/>
               </w:rPr>
+              <w:lastRenderedPageBreak/>
               <w:t>IPv4</w:t>
             </w:r>
             <w:r>
@@ -3844,7 +4080,6 @@
               <w:rPr>
                 <w:b/>
               </w:rPr>
-              <w:lastRenderedPageBreak/>
               <w:t>IPv</w:t>
             </w:r>
             <w:r>
@@ -4272,6 +4507,7 @@
           <w:b/>
           <w:bCs/>
         </w:rPr>
+        <w:lastRenderedPageBreak/>
         <w:t>Important</w:t>
       </w:r>
       <w:r>
@@ -4296,7 +4532,6 @@
           <w:rFonts w:cs="Segoe UI Symbol"/>
           <w:bCs/>
         </w:rPr>
-        <w:lastRenderedPageBreak/>
         <w:t>Before submitting your validation package, highlight the required configuration items identified below. Highlighting these items helps the Director of Network Engineering quickly verify compliance with the Enterprise Change Request and Enterprise Network Standards.</w:t>
       </w:r>
     </w:p>
@@ -4734,6 +4969,7 @@
         <w:spacing w:before="100" w:beforeAutospacing="1" w:after="100" w:afterAutospacing="1"/>
       </w:pPr>
       <w:r>
+        <w:lastRenderedPageBreak/>
         <w:t xml:space="preserve">Port-Channel 1 </w:t>
       </w:r>
     </w:p>
@@ -4746,7 +4982,6 @@
         <w:spacing w:before="100" w:beforeAutospacing="1" w:after="100" w:afterAutospacing="1"/>
       </w:pPr>
       <w:r>
-        <w:lastRenderedPageBreak/>
         <w:t xml:space="preserve">Trunk Status </w:t>
       </w:r>
     </w:p>
@@ -5115,6 +5350,7 @@
           <w:bCs/>
           <w:highlight w:val="yellow"/>
         </w:rPr>
+        <w:lastRenderedPageBreak/>
         <w:t>Highlight the following:</w:t>
       </w:r>
     </w:p>
@@ -5127,7 +5363,6 @@
         <w:spacing w:before="100" w:beforeAutospacing="1" w:after="100" w:afterAutospacing="1"/>
       </w:pPr>
       <w:r>
-        <w:lastRenderedPageBreak/>
         <w:t xml:space="preserve">Root Bridge </w:t>
       </w:r>
     </w:p>
@@ -5493,6 +5728,7 @@
           <w:b/>
           <w:bCs/>
         </w:rPr>
+        <w:lastRenderedPageBreak/>
         <w:t>Device:</w:t>
       </w:r>
       <w:r>
@@ -5509,7 +5745,6 @@
           <w:bCs/>
           <w:highlight w:val="yellow"/>
         </w:rPr>
-        <w:lastRenderedPageBreak/>
         <w:t xml:space="preserve">Highlight </w:t>
       </w:r>
       <w:r>
@@ -5905,6 +6140,7 @@
         <w:pStyle w:val="Heading3"/>
       </w:pPr>
       <w:r>
+        <w:lastRenderedPageBreak/>
         <w:t>Verify SSH Configuration</w:t>
       </w:r>
     </w:p>
@@ -5917,7 +6153,6 @@
           <w:b/>
           <w:bCs/>
         </w:rPr>
-        <w:lastRenderedPageBreak/>
         <w:t>Command:</w:t>
       </w:r>
     </w:p>
@@ -6021,30 +6256,6 @@
       </w:pPr>
       <w:r>
         <w:t xml:space="preserve">SSH Version </w:t>
-      </w:r>
-    </w:p>
-    <w:p>
-      <w:pPr>
-        <w:numPr>
-          <w:ilvl w:val="0"/>
-          <w:numId w:val="17"/>
-        </w:numPr>
-        <w:spacing w:before="100" w:beforeAutospacing="1" w:after="100" w:afterAutospacing="1"/>
-      </w:pPr>
-      <w:r>
-        <w:t xml:space="preserve">Authentication Timeout </w:t>
-      </w:r>
-    </w:p>
-    <w:p>
-      <w:pPr>
-        <w:numPr>
-          <w:ilvl w:val="0"/>
-          <w:numId w:val="17"/>
-        </w:numPr>
-        <w:spacing w:before="100" w:beforeAutospacing="1" w:after="100" w:afterAutospacing="1"/>
-      </w:pPr>
-      <w:r>
-        <w:t xml:space="preserve">Authentication Retries </w:t>
       </w:r>
     </w:p>
     <w:p>
@@ -6490,7 +6701,7 @@
           <w:ilvl w:val="0"/>
           <w:numId w:val="18"/>
         </w:numPr>
-        <w:spacing w:before="100" w:beforeAutospacing="1" w:after="100" w:afterAutospacing="1"/>
+        <w:spacing w:before="100" w:beforeAutospacing="1" w:after="100" w:afterAutospacing="1" w:line="276" w:lineRule="auto"/>
       </w:pPr>
       <w:r>
         <w:t xml:space="preserve">Active SSH Sessions </w:t>
@@ -6502,7 +6713,7 @@
           <w:ilvl w:val="0"/>
           <w:numId w:val="18"/>
         </w:numPr>
-        <w:spacing w:before="100" w:beforeAutospacing="1" w:after="100" w:afterAutospacing="1"/>
+        <w:spacing w:before="100" w:beforeAutospacing="1" w:after="100" w:afterAutospacing="1" w:line="276" w:lineRule="auto"/>
       </w:pPr>
       <w:r>
         <w:t xml:space="preserve">SSH Connection Status </w:t>
@@ -7459,8 +7670,6 @@
         </w:rPr>
         <w:t xml:space="preserve"> Standards</w:t>
       </w:r>
-      <w:bookmarkStart w:id="0" w:name="_GoBack"/>
-      <w:bookmarkEnd w:id="0"/>
       <w:r>
         <w:t xml:space="preserve"> and assist with troubleshooting if necessary.</w:t>
       </w:r>
@@ -7533,28 +7742,15 @@
       <w:r>
         <w:rPr>
           <w:b/>
-        </w:rPr>
-        <w:t>Highlight the configuration items implemented as part of this Enterprise Change Request that apply to each device.</w:t>
-      </w:r>
-    </w:p>
-    <w:p>
-      <w:pPr>
-        <w:spacing w:before="100" w:beforeAutospacing="1" w:after="100" w:afterAutospacing="1"/>
-      </w:pPr>
+          <w:highlight w:val="yellow"/>
+        </w:rPr>
+        <w:t>Highlight</w:t>
+      </w:r>
       <w:r>
         <w:rPr>
           <w:b/>
-          <w:bCs/>
-          <w:highlight w:val="yellow"/>
-        </w:rPr>
-        <w:t>Highlight</w:t>
-      </w:r>
-      <w:r>
-        <w:rPr>
-          <w:b/>
-          <w:bCs/>
-        </w:rPr>
-        <w:t xml:space="preserve"> the following (as applicable to each device):</w:t>
+        </w:rPr>
+        <w:t xml:space="preserve"> the configuration items implemented as part of this Enterprise Change Request that apply to each device.</w:t>
       </w:r>
     </w:p>
     <w:p>
@@ -7563,7 +7759,7 @@
           <w:ilvl w:val="0"/>
           <w:numId w:val="20"/>
         </w:numPr>
-        <w:spacing w:before="100" w:beforeAutospacing="1" w:after="100" w:afterAutospacing="1"/>
+        <w:spacing w:before="100" w:beforeAutospacing="1" w:after="100" w:afterAutospacing="1" w:line="276" w:lineRule="auto"/>
       </w:pPr>
       <w:r>
         <w:t xml:space="preserve">Channel-group configuration </w:t>
@@ -7575,7 +7771,7 @@
           <w:ilvl w:val="0"/>
           <w:numId w:val="20"/>
         </w:numPr>
-        <w:spacing w:before="100" w:beforeAutospacing="1" w:after="100" w:afterAutospacing="1"/>
+        <w:spacing w:before="100" w:beforeAutospacing="1" w:after="100" w:afterAutospacing="1" w:line="276" w:lineRule="auto"/>
       </w:pPr>
       <w:r>
         <w:t xml:space="preserve">Port-Channel interface configuration </w:t>
@@ -7587,7 +7783,7 @@
           <w:ilvl w:val="0"/>
           <w:numId w:val="20"/>
         </w:numPr>
-        <w:spacing w:before="100" w:beforeAutospacing="1" w:after="100" w:afterAutospacing="1"/>
+        <w:spacing w:before="100" w:beforeAutospacing="1" w:after="100" w:afterAutospacing="1" w:line="276" w:lineRule="auto"/>
       </w:pPr>
       <w:r>
         <w:t xml:space="preserve">Interface descriptions </w:t>
@@ -7599,7 +7795,7 @@
           <w:ilvl w:val="0"/>
           <w:numId w:val="20"/>
         </w:numPr>
-        <w:spacing w:before="100" w:beforeAutospacing="1" w:after="100" w:afterAutospacing="1"/>
+        <w:spacing w:before="100" w:beforeAutospacing="1" w:after="100" w:afterAutospacing="1" w:line="276" w:lineRule="auto"/>
       </w:pPr>
       <w:r>
         <w:t xml:space="preserve">Root Bridge Priority </w:t>
@@ -7611,7 +7807,7 @@
           <w:ilvl w:val="0"/>
           <w:numId w:val="20"/>
         </w:numPr>
-        <w:spacing w:before="100" w:beforeAutospacing="1" w:after="100" w:afterAutospacing="1"/>
+        <w:spacing w:before="100" w:beforeAutospacing="1" w:after="100" w:afterAutospacing="1" w:line="276" w:lineRule="auto"/>
       </w:pPr>
       <w:proofErr w:type="spellStart"/>
       <w:r>
@@ -7628,7 +7824,7 @@
           <w:ilvl w:val="0"/>
           <w:numId w:val="20"/>
         </w:numPr>
-        <w:spacing w:before="100" w:beforeAutospacing="1" w:after="100" w:afterAutospacing="1"/>
+        <w:spacing w:before="100" w:beforeAutospacing="1" w:after="100" w:afterAutospacing="1" w:line="276" w:lineRule="auto"/>
       </w:pPr>
       <w:r>
         <w:t xml:space="preserve">BPDU Guard configuration </w:t>
@@ -7640,10 +7836,9 @@
           <w:ilvl w:val="0"/>
           <w:numId w:val="20"/>
         </w:numPr>
-        <w:spacing w:before="100" w:beforeAutospacing="1" w:after="100" w:afterAutospacing="1"/>
-      </w:pPr>
-      <w:r>
-        <w:lastRenderedPageBreak/>
+        <w:spacing w:before="100" w:beforeAutospacing="1" w:after="100" w:afterAutospacing="1" w:line="276" w:lineRule="auto"/>
+      </w:pPr>
+      <w:r>
         <w:t xml:space="preserve">Root Guard configuration </w:t>
       </w:r>
     </w:p>
@@ -7653,9 +7848,10 @@
           <w:ilvl w:val="0"/>
           <w:numId w:val="20"/>
         </w:numPr>
-        <w:spacing w:before="100" w:beforeAutospacing="1" w:after="100" w:afterAutospacing="1"/>
-      </w:pPr>
-      <w:r>
+        <w:spacing w:before="100" w:beforeAutospacing="1" w:after="100" w:afterAutospacing="1" w:line="276" w:lineRule="auto"/>
+      </w:pPr>
+      <w:r>
+        <w:lastRenderedPageBreak/>
         <w:t xml:space="preserve">Maximum Secure MAC Addresses </w:t>
       </w:r>
     </w:p>
@@ -7665,7 +7861,7 @@
           <w:ilvl w:val="0"/>
           <w:numId w:val="20"/>
         </w:numPr>
-        <w:spacing w:before="100" w:beforeAutospacing="1" w:after="100" w:afterAutospacing="1"/>
+        <w:spacing w:before="100" w:beforeAutospacing="1" w:after="100" w:afterAutospacing="1" w:line="276" w:lineRule="auto"/>
       </w:pPr>
       <w:r>
         <w:t xml:space="preserve">Sticky MAC configuration </w:t>
@@ -7677,7 +7873,7 @@
           <w:ilvl w:val="0"/>
           <w:numId w:val="20"/>
         </w:numPr>
-        <w:spacing w:before="100" w:beforeAutospacing="1" w:after="100" w:afterAutospacing="1"/>
+        <w:spacing w:before="100" w:beforeAutospacing="1" w:after="100" w:afterAutospacing="1" w:line="276" w:lineRule="auto"/>
       </w:pPr>
       <w:r>
         <w:t>Port Security violation mode (</w:t>
@@ -7699,7 +7895,7 @@
           <w:ilvl w:val="0"/>
           <w:numId w:val="20"/>
         </w:numPr>
-        <w:spacing w:before="100" w:beforeAutospacing="1" w:after="100" w:afterAutospacing="1"/>
+        <w:spacing w:before="100" w:beforeAutospacing="1" w:after="100" w:afterAutospacing="1" w:line="276" w:lineRule="auto"/>
       </w:pPr>
       <w:r>
         <w:t xml:space="preserve">Parking Lot VLAN assignments </w:t>
@@ -7711,7 +7907,7 @@
           <w:ilvl w:val="0"/>
           <w:numId w:val="20"/>
         </w:numPr>
-        <w:spacing w:before="100" w:beforeAutospacing="1" w:after="100" w:afterAutospacing="1"/>
+        <w:spacing w:before="100" w:beforeAutospacing="1" w:after="100" w:afterAutospacing="1" w:line="276" w:lineRule="auto"/>
       </w:pPr>
       <w:r>
         <w:t xml:space="preserve">Shutdown unused interfaces </w:t>
@@ -7723,7 +7919,7 @@
           <w:ilvl w:val="0"/>
           <w:numId w:val="20"/>
         </w:numPr>
-        <w:spacing w:before="100" w:beforeAutospacing="1" w:after="100" w:afterAutospacing="1"/>
+        <w:spacing w:before="100" w:beforeAutospacing="1" w:after="100" w:afterAutospacing="1" w:line="276" w:lineRule="auto"/>
       </w:pPr>
       <w:r>
         <w:t xml:space="preserve">Local username </w:t>
@@ -7735,7 +7931,7 @@
           <w:ilvl w:val="0"/>
           <w:numId w:val="20"/>
         </w:numPr>
-        <w:spacing w:before="100" w:beforeAutospacing="1" w:after="100" w:afterAutospacing="1"/>
+        <w:spacing w:before="100" w:beforeAutospacing="1" w:after="100" w:afterAutospacing="1" w:line="276" w:lineRule="auto"/>
       </w:pPr>
       <w:r>
         <w:t xml:space="preserve">Privilege level </w:t>
@@ -7747,7 +7943,7 @@
           <w:ilvl w:val="0"/>
           <w:numId w:val="20"/>
         </w:numPr>
-        <w:spacing w:before="100" w:beforeAutospacing="1" w:after="100" w:afterAutospacing="1"/>
+        <w:spacing w:before="100" w:beforeAutospacing="1" w:after="100" w:afterAutospacing="1" w:line="276" w:lineRule="auto"/>
       </w:pPr>
       <w:r>
         <w:t xml:space="preserve">Domain name </w:t>
@@ -7759,7 +7955,7 @@
           <w:ilvl w:val="0"/>
           <w:numId w:val="20"/>
         </w:numPr>
-        <w:spacing w:before="100" w:beforeAutospacing="1" w:after="100" w:afterAutospacing="1"/>
+        <w:spacing w:before="100" w:beforeAutospacing="1" w:after="100" w:afterAutospacing="1" w:line="276" w:lineRule="auto"/>
       </w:pPr>
       <w:r>
         <w:t xml:space="preserve">VTY configuration </w:t>
@@ -7771,13 +7967,11 @@
           <w:ilvl w:val="0"/>
           <w:numId w:val="20"/>
         </w:numPr>
-        <w:spacing w:before="100" w:beforeAutospacing="1" w:after="100" w:afterAutospacing="1"/>
+        <w:spacing w:before="100" w:beforeAutospacing="1" w:after="100" w:afterAutospacing="1" w:line="276" w:lineRule="auto"/>
       </w:pPr>
       <w:r>
         <w:rPr>
           <w:rFonts w:ascii="Courier New" w:hAnsi="Courier New" w:cs="Courier New"/>
-          <w:sz w:val="20"/>
-          <w:szCs w:val="20"/>
         </w:rPr>
         <w:t>login local</w:t>
       </w:r>
@@ -7791,13 +7985,11 @@
           <w:ilvl w:val="0"/>
           <w:numId w:val="20"/>
         </w:numPr>
-        <w:spacing w:before="100" w:beforeAutospacing="1" w:after="100" w:afterAutospacing="1"/>
+        <w:spacing w:before="100" w:beforeAutospacing="1" w:after="100" w:afterAutospacing="1" w:line="276" w:lineRule="auto"/>
       </w:pPr>
       <w:r>
         <w:rPr>
           <w:rFonts w:ascii="Courier New" w:hAnsi="Courier New" w:cs="Courier New"/>
-          <w:sz w:val="20"/>
-          <w:szCs w:val="20"/>
         </w:rPr>
         <w:t xml:space="preserve">transport input </w:t>
       </w:r>
@@ -7805,8 +7997,6 @@
       <w:r>
         <w:rPr>
           <w:rFonts w:ascii="Courier New" w:hAnsi="Courier New" w:cs="Courier New"/>
-          <w:sz w:val="20"/>
-          <w:szCs w:val="20"/>
         </w:rPr>
         <w:t>ssh</w:t>
       </w:r>
@@ -8119,7 +8309,12 @@
         <w:pStyle w:val="Heading4"/>
       </w:pPr>
       <w:r>
-        <w:t>Step 5 – Final Validation</w:t>
+        <w:t>Step 8</w:t>
+      </w:r>
+      <w:bookmarkStart w:id="0" w:name="_GoBack"/>
+      <w:bookmarkEnd w:id="0"/>
+      <w:r>
+        <w:t xml:space="preserve"> – Final Validation</w:t>
       </w:r>
     </w:p>
     <w:p>
@@ -8163,7 +8358,7 @@
           <w:ilvl w:val="0"/>
           <w:numId w:val="9"/>
         </w:numPr>
-        <w:spacing w:before="100" w:beforeAutospacing="1" w:after="100" w:afterAutospacing="1"/>
+        <w:spacing w:before="100" w:beforeAutospacing="1" w:after="100" w:afterAutospacing="1" w:line="276" w:lineRule="auto"/>
       </w:pPr>
       <w:r>
         <w:t xml:space="preserve">All required configurations have been completed. </w:t>
@@ -8175,7 +8370,7 @@
           <w:ilvl w:val="0"/>
           <w:numId w:val="9"/>
         </w:numPr>
-        <w:spacing w:before="100" w:beforeAutospacing="1" w:after="100" w:afterAutospacing="1"/>
+        <w:spacing w:before="100" w:beforeAutospacing="1" w:after="100" w:afterAutospacing="1" w:line="276" w:lineRule="auto"/>
       </w:pPr>
       <w:r>
         <w:t xml:space="preserve">All verification tests have passed. </w:t>
@@ -8187,7 +8382,7 @@
           <w:ilvl w:val="0"/>
           <w:numId w:val="9"/>
         </w:numPr>
-        <w:spacing w:before="100" w:beforeAutospacing="1" w:after="100" w:afterAutospacing="1"/>
+        <w:spacing w:before="100" w:beforeAutospacing="1" w:after="100" w:afterAutospacing="1" w:line="276" w:lineRule="auto"/>
       </w:pPr>
       <w:r>
         <w:t xml:space="preserve">All device configurations have been saved. </w:t>
@@ -8199,7 +8394,7 @@
           <w:ilvl w:val="0"/>
           <w:numId w:val="9"/>
         </w:numPr>
-        <w:spacing w:before="100" w:beforeAutospacing="1" w:after="100" w:afterAutospacing="1"/>
+        <w:spacing w:before="100" w:beforeAutospacing="1" w:after="100" w:afterAutospacing="1" w:line="276" w:lineRule="auto"/>
       </w:pPr>
       <w:r>
         <w:t xml:space="preserve">The enterprise network is operating according to the Enterprise Network Standards Guide. </w:t>
@@ -8229,7 +8424,7 @@
     </w:p>
     <w:p>
       <w:pPr>
-        <w:spacing w:before="100" w:beforeAutospacing="1"/>
+        <w:spacing w:line="276" w:lineRule="auto"/>
       </w:pPr>
       <w:sdt>
         <w:sdtPr>
@@ -8259,7 +8454,7 @@
     </w:p>
     <w:p>
       <w:pPr>
-        <w:spacing w:before="100" w:beforeAutospacing="1" w:after="100" w:afterAutospacing="1"/>
+        <w:spacing w:line="276" w:lineRule="auto"/>
       </w:pPr>
       <w:sdt>
         <w:sdtPr>
@@ -8289,7 +8484,7 @@
     </w:p>
     <w:p>
       <w:pPr>
-        <w:spacing w:before="100" w:beforeAutospacing="1"/>
+        <w:spacing w:line="276" w:lineRule="auto"/>
       </w:pPr>
       <w:sdt>
         <w:sdtPr>
@@ -8322,37 +8517,7 @@
     </w:p>
     <w:p>
       <w:pPr>
-        <w:spacing w:before="100" w:beforeAutospacing="1" w:after="100" w:afterAutospacing="1"/>
-      </w:pPr>
-      <w:sdt>
-        <w:sdtPr>
-          <w:id w:val="400484385"/>
-          <w14:checkbox>
-            <w14:checked w14:val="0"/>
-            <w14:checkedState w14:val="2612" w14:font="MS Gothic"/>
-            <w14:uncheckedState w14:val="2610" w14:font="MS Gothic"/>
-          </w14:checkbox>
-        </w:sdtPr>
-        <w:sdtEndPr/>
-        <w:sdtContent>
-          <w:r>
-            <w:rPr>
-              <w:rFonts w:ascii="MS Gothic" w:eastAsia="MS Gothic" w:hAnsi="MS Gothic" w:hint="eastAsia"/>
-            </w:rPr>
-            <w:t>☐</w:t>
-          </w:r>
-        </w:sdtContent>
-      </w:sdt>
-      <w:r>
-        <w:t xml:space="preserve">  </w:t>
-      </w:r>
-      <w:r>
-        <w:t xml:space="preserve">Enterprise Implementation </w:t>
-      </w:r>
-    </w:p>
-    <w:p>
-      <w:pPr>
-        <w:spacing w:before="100" w:beforeAutospacing="1" w:after="100" w:afterAutospacing="1"/>
+        <w:spacing w:after="100" w:afterAutospacing="1" w:line="276" w:lineRule="auto"/>
       </w:pPr>
       <w:sdt>
         <w:sdtPr>
@@ -8405,7 +8570,7 @@
           <w:sz w:val="18"/>
           <w:szCs w:val="18"/>
         </w:rPr>
-        <w:t>Version 1: Updated 07/05</w:t>
+        <w:t>Version 1: Updated 08/20</w:t>
       </w:r>
       <w:r>
         <w:rPr>
@@ -8970,6 +9135,529 @@
     </w:lvl>
   </w:abstractNum>
   <w:abstractNum w:abstractNumId="8" w15:restartNumberingAfterBreak="0">
+    <w:nsid w:val="03FF00B2"/>
+    <w:multiLevelType w:val="multilevel"/>
+    <w:tmpl w:val="950ED18A"/>
+    <w:lvl w:ilvl="0">
+      <w:start w:val="1"/>
+      <w:numFmt w:val="bullet"/>
+      <w:lvlText w:val=""/>
+      <w:lvlJc w:val="left"/>
+      <w:pPr>
+        <w:tabs>
+          <w:tab w:val="num" w:pos="720"/>
+        </w:tabs>
+        <w:ind w:left="720" w:hanging="360"/>
+      </w:pPr>
+      <w:rPr>
+        <w:rFonts w:ascii="Symbol" w:hAnsi="Symbol" w:hint="default"/>
+        <w:sz w:val="20"/>
+      </w:rPr>
+    </w:lvl>
+    <w:lvl w:ilvl="1" w:tentative="1">
+      <w:start w:val="1"/>
+      <w:numFmt w:val="bullet"/>
+      <w:lvlText w:val="o"/>
+      <w:lvlJc w:val="left"/>
+      <w:pPr>
+        <w:tabs>
+          <w:tab w:val="num" w:pos="1440"/>
+        </w:tabs>
+        <w:ind w:left="1440" w:hanging="360"/>
+      </w:pPr>
+      <w:rPr>
+        <w:rFonts w:ascii="Courier New" w:hAnsi="Courier New" w:hint="default"/>
+        <w:sz w:val="20"/>
+      </w:rPr>
+    </w:lvl>
+    <w:lvl w:ilvl="2" w:tentative="1">
+      <w:start w:val="1"/>
+      <w:numFmt w:val="bullet"/>
+      <w:lvlText w:val=""/>
+      <w:lvlJc w:val="left"/>
+      <w:pPr>
+        <w:tabs>
+          <w:tab w:val="num" w:pos="2160"/>
+        </w:tabs>
+        <w:ind w:left="2160" w:hanging="360"/>
+      </w:pPr>
+      <w:rPr>
+        <w:rFonts w:ascii="Wingdings" w:hAnsi="Wingdings" w:hint="default"/>
+        <w:sz w:val="20"/>
+      </w:rPr>
+    </w:lvl>
+    <w:lvl w:ilvl="3" w:tentative="1">
+      <w:start w:val="1"/>
+      <w:numFmt w:val="bullet"/>
+      <w:lvlText w:val=""/>
+      <w:lvlJc w:val="left"/>
+      <w:pPr>
+        <w:tabs>
+          <w:tab w:val="num" w:pos="2880"/>
+        </w:tabs>
+        <w:ind w:left="2880" w:hanging="360"/>
+      </w:pPr>
+      <w:rPr>
+        <w:rFonts w:ascii="Wingdings" w:hAnsi="Wingdings" w:hint="default"/>
+        <w:sz w:val="20"/>
+      </w:rPr>
+    </w:lvl>
+    <w:lvl w:ilvl="4" w:tentative="1">
+      <w:start w:val="1"/>
+      <w:numFmt w:val="bullet"/>
+      <w:lvlText w:val=""/>
+      <w:lvlJc w:val="left"/>
+      <w:pPr>
+        <w:tabs>
+          <w:tab w:val="num" w:pos="3600"/>
+        </w:tabs>
+        <w:ind w:left="3600" w:hanging="360"/>
+      </w:pPr>
+      <w:rPr>
+        <w:rFonts w:ascii="Wingdings" w:hAnsi="Wingdings" w:hint="default"/>
+        <w:sz w:val="20"/>
+      </w:rPr>
+    </w:lvl>
+    <w:lvl w:ilvl="5" w:tentative="1">
+      <w:start w:val="1"/>
+      <w:numFmt w:val="bullet"/>
+      <w:lvlText w:val=""/>
+      <w:lvlJc w:val="left"/>
+      <w:pPr>
+        <w:tabs>
+          <w:tab w:val="num" w:pos="4320"/>
+        </w:tabs>
+        <w:ind w:left="4320" w:hanging="360"/>
+      </w:pPr>
+      <w:rPr>
+        <w:rFonts w:ascii="Wingdings" w:hAnsi="Wingdings" w:hint="default"/>
+        <w:sz w:val="20"/>
+      </w:rPr>
+    </w:lvl>
+    <w:lvl w:ilvl="6" w:tentative="1">
+      <w:start w:val="1"/>
+      <w:numFmt w:val="bullet"/>
+      <w:lvlText w:val=""/>
+      <w:lvlJc w:val="left"/>
+      <w:pPr>
+        <w:tabs>
+          <w:tab w:val="num" w:pos="5040"/>
+        </w:tabs>
+        <w:ind w:left="5040" w:hanging="360"/>
+      </w:pPr>
+      <w:rPr>
+        <w:rFonts w:ascii="Wingdings" w:hAnsi="Wingdings" w:hint="default"/>
+        <w:sz w:val="20"/>
+      </w:rPr>
+    </w:lvl>
+    <w:lvl w:ilvl="7" w:tentative="1">
+      <w:start w:val="1"/>
+      <w:numFmt w:val="bullet"/>
+      <w:lvlText w:val=""/>
+      <w:lvlJc w:val="left"/>
+      <w:pPr>
+        <w:tabs>
+          <w:tab w:val="num" w:pos="5760"/>
+        </w:tabs>
+        <w:ind w:left="5760" w:hanging="360"/>
+      </w:pPr>
+      <w:rPr>
+        <w:rFonts w:ascii="Wingdings" w:hAnsi="Wingdings" w:hint="default"/>
+        <w:sz w:val="20"/>
+      </w:rPr>
+    </w:lvl>
+    <w:lvl w:ilvl="8" w:tentative="1">
+      <w:start w:val="1"/>
+      <w:numFmt w:val="bullet"/>
+      <w:lvlText w:val=""/>
+      <w:lvlJc w:val="left"/>
+      <w:pPr>
+        <w:tabs>
+          <w:tab w:val="num" w:pos="6480"/>
+        </w:tabs>
+        <w:ind w:left="6480" w:hanging="360"/>
+      </w:pPr>
+      <w:rPr>
+        <w:rFonts w:ascii="Wingdings" w:hAnsi="Wingdings" w:hint="default"/>
+        <w:sz w:val="20"/>
+      </w:rPr>
+    </w:lvl>
+  </w:abstractNum>
+  <w:abstractNum w:abstractNumId="9" w15:restartNumberingAfterBreak="0">
+    <w:nsid w:val="078A6C92"/>
+    <w:multiLevelType w:val="hybridMultilevel"/>
+    <w:tmpl w:val="D73EEAAE"/>
+    <w:lvl w:ilvl="0" w:tplc="9F74BE3A">
+      <w:numFmt w:val="bullet"/>
+      <w:lvlText w:val=""/>
+      <w:lvlJc w:val="left"/>
+      <w:pPr>
+        <w:ind w:left="1800" w:hanging="360"/>
+      </w:pPr>
+      <w:rPr>
+        <w:rFonts w:ascii="Symbol" w:eastAsia="Times New Roman" w:hAnsi="Symbol" w:cs="Times New Roman" w:hint="default"/>
+      </w:rPr>
+    </w:lvl>
+    <w:lvl w:ilvl="1" w:tplc="04090003" w:tentative="1">
+      <w:start w:val="1"/>
+      <w:numFmt w:val="bullet"/>
+      <w:lvlText w:val="o"/>
+      <w:lvlJc w:val="left"/>
+      <w:pPr>
+        <w:ind w:left="2160" w:hanging="360"/>
+      </w:pPr>
+      <w:rPr>
+        <w:rFonts w:ascii="Courier New" w:hAnsi="Courier New" w:cs="Courier New" w:hint="default"/>
+      </w:rPr>
+    </w:lvl>
+    <w:lvl w:ilvl="2" w:tplc="04090005" w:tentative="1">
+      <w:start w:val="1"/>
+      <w:numFmt w:val="bullet"/>
+      <w:lvlText w:val=""/>
+      <w:lvlJc w:val="left"/>
+      <w:pPr>
+        <w:ind w:left="2880" w:hanging="360"/>
+      </w:pPr>
+      <w:rPr>
+        <w:rFonts w:ascii="Wingdings" w:hAnsi="Wingdings" w:hint="default"/>
+      </w:rPr>
+    </w:lvl>
+    <w:lvl w:ilvl="3" w:tplc="04090001" w:tentative="1">
+      <w:start w:val="1"/>
+      <w:numFmt w:val="bullet"/>
+      <w:lvlText w:val=""/>
+      <w:lvlJc w:val="left"/>
+      <w:pPr>
+        <w:ind w:left="3600" w:hanging="360"/>
+      </w:pPr>
+      <w:rPr>
+        <w:rFonts w:ascii="Symbol" w:hAnsi="Symbol" w:hint="default"/>
+      </w:rPr>
+    </w:lvl>
+    <w:lvl w:ilvl="4" w:tplc="04090003" w:tentative="1">
+      <w:start w:val="1"/>
+      <w:numFmt w:val="bullet"/>
+      <w:lvlText w:val="o"/>
+      <w:lvlJc w:val="left"/>
+      <w:pPr>
+        <w:ind w:left="4320" w:hanging="360"/>
+      </w:pPr>
+      <w:rPr>
+        <w:rFonts w:ascii="Courier New" w:hAnsi="Courier New" w:cs="Courier New" w:hint="default"/>
+      </w:rPr>
+    </w:lvl>
+    <w:lvl w:ilvl="5" w:tplc="04090005" w:tentative="1">
+      <w:start w:val="1"/>
+      <w:numFmt w:val="bullet"/>
+      <w:lvlText w:val=""/>
+      <w:lvlJc w:val="left"/>
+      <w:pPr>
+        <w:ind w:left="5040" w:hanging="360"/>
+      </w:pPr>
+      <w:rPr>
+        <w:rFonts w:ascii="Wingdings" w:hAnsi="Wingdings" w:hint="default"/>
+      </w:rPr>
+    </w:lvl>
+    <w:lvl w:ilvl="6" w:tplc="04090001" w:tentative="1">
+      <w:start w:val="1"/>
+      <w:numFmt w:val="bullet"/>
+      <w:lvlText w:val=""/>
+      <w:lvlJc w:val="left"/>
+      <w:pPr>
+        <w:ind w:left="5760" w:hanging="360"/>
+      </w:pPr>
+      <w:rPr>
+        <w:rFonts w:ascii="Symbol" w:hAnsi="Symbol" w:hint="default"/>
+      </w:rPr>
+    </w:lvl>
+    <w:lvl w:ilvl="7" w:tplc="04090003" w:tentative="1">
+      <w:start w:val="1"/>
+      <w:numFmt w:val="bullet"/>
+      <w:lvlText w:val="o"/>
+      <w:lvlJc w:val="left"/>
+      <w:pPr>
+        <w:ind w:left="6480" w:hanging="360"/>
+      </w:pPr>
+      <w:rPr>
+        <w:rFonts w:ascii="Courier New" w:hAnsi="Courier New" w:cs="Courier New" w:hint="default"/>
+      </w:rPr>
+    </w:lvl>
+    <w:lvl w:ilvl="8" w:tplc="04090005" w:tentative="1">
+      <w:start w:val="1"/>
+      <w:numFmt w:val="bullet"/>
+      <w:lvlText w:val=""/>
+      <w:lvlJc w:val="left"/>
+      <w:pPr>
+        <w:ind w:left="7200" w:hanging="360"/>
+      </w:pPr>
+      <w:rPr>
+        <w:rFonts w:ascii="Wingdings" w:hAnsi="Wingdings" w:hint="default"/>
+      </w:rPr>
+    </w:lvl>
+  </w:abstractNum>
+  <w:abstractNum w:abstractNumId="10" w15:restartNumberingAfterBreak="0">
+    <w:nsid w:val="08705C7D"/>
+    <w:multiLevelType w:val="multilevel"/>
+    <w:tmpl w:val="EF64540C"/>
+    <w:lvl w:ilvl="0">
+      <w:start w:val="1"/>
+      <w:numFmt w:val="bullet"/>
+      <w:lvlText w:val=""/>
+      <w:lvlJc w:val="left"/>
+      <w:pPr>
+        <w:tabs>
+          <w:tab w:val="num" w:pos="720"/>
+        </w:tabs>
+        <w:ind w:left="720" w:hanging="360"/>
+      </w:pPr>
+      <w:rPr>
+        <w:rFonts w:ascii="Symbol" w:hAnsi="Symbol" w:hint="default"/>
+        <w:sz w:val="20"/>
+      </w:rPr>
+    </w:lvl>
+    <w:lvl w:ilvl="1" w:tentative="1">
+      <w:start w:val="1"/>
+      <w:numFmt w:val="bullet"/>
+      <w:lvlText w:val="o"/>
+      <w:lvlJc w:val="left"/>
+      <w:pPr>
+        <w:tabs>
+          <w:tab w:val="num" w:pos="1440"/>
+        </w:tabs>
+        <w:ind w:left="1440" w:hanging="360"/>
+      </w:pPr>
+      <w:rPr>
+        <w:rFonts w:ascii="Courier New" w:hAnsi="Courier New" w:hint="default"/>
+        <w:sz w:val="20"/>
+      </w:rPr>
+    </w:lvl>
+    <w:lvl w:ilvl="2" w:tentative="1">
+      <w:start w:val="1"/>
+      <w:numFmt w:val="bullet"/>
+      <w:lvlText w:val=""/>
+      <w:lvlJc w:val="left"/>
+      <w:pPr>
+        <w:tabs>
+          <w:tab w:val="num" w:pos="2160"/>
+        </w:tabs>
+        <w:ind w:left="2160" w:hanging="360"/>
+      </w:pPr>
+      <w:rPr>
+        <w:rFonts w:ascii="Wingdings" w:hAnsi="Wingdings" w:hint="default"/>
+        <w:sz w:val="20"/>
+      </w:rPr>
+    </w:lvl>
+    <w:lvl w:ilvl="3" w:tentative="1">
+      <w:start w:val="1"/>
+      <w:numFmt w:val="bullet"/>
+      <w:lvlText w:val=""/>
+      <w:lvlJc w:val="left"/>
+      <w:pPr>
+        <w:tabs>
+          <w:tab w:val="num" w:pos="2880"/>
+        </w:tabs>
+        <w:ind w:left="2880" w:hanging="360"/>
+      </w:pPr>
+      <w:rPr>
+        <w:rFonts w:ascii="Wingdings" w:hAnsi="Wingdings" w:hint="default"/>
+        <w:sz w:val="20"/>
+      </w:rPr>
+    </w:lvl>
+    <w:lvl w:ilvl="4" w:tentative="1">
+      <w:start w:val="1"/>
+      <w:numFmt w:val="bullet"/>
+      <w:lvlText w:val=""/>
+      <w:lvlJc w:val="left"/>
+      <w:pPr>
+        <w:tabs>
+          <w:tab w:val="num" w:pos="3600"/>
+        </w:tabs>
+        <w:ind w:left="3600" w:hanging="360"/>
+      </w:pPr>
+      <w:rPr>
+        <w:rFonts w:ascii="Wingdings" w:hAnsi="Wingdings" w:hint="default"/>
+        <w:sz w:val="20"/>
+      </w:rPr>
+    </w:lvl>
+    <w:lvl w:ilvl="5" w:tentative="1">
+      <w:start w:val="1"/>
+      <w:numFmt w:val="bullet"/>
+      <w:lvlText w:val=""/>
+      <w:lvlJc w:val="left"/>
+      <w:pPr>
+        <w:tabs>
+          <w:tab w:val="num" w:pos="4320"/>
+        </w:tabs>
+        <w:ind w:left="4320" w:hanging="360"/>
+      </w:pPr>
+      <w:rPr>
+        <w:rFonts w:ascii="Wingdings" w:hAnsi="Wingdings" w:hint="default"/>
+        <w:sz w:val="20"/>
+      </w:rPr>
+    </w:lvl>
+    <w:lvl w:ilvl="6" w:tentative="1">
+      <w:start w:val="1"/>
+      <w:numFmt w:val="bullet"/>
+      <w:lvlText w:val=""/>
+      <w:lvlJc w:val="left"/>
+      <w:pPr>
+        <w:tabs>
+          <w:tab w:val="num" w:pos="5040"/>
+        </w:tabs>
+        <w:ind w:left="5040" w:hanging="360"/>
+      </w:pPr>
+      <w:rPr>
+        <w:rFonts w:ascii="Wingdings" w:hAnsi="Wingdings" w:hint="default"/>
+        <w:sz w:val="20"/>
+      </w:rPr>
+    </w:lvl>
+    <w:lvl w:ilvl="7" w:tentative="1">
+      <w:start w:val="1"/>
+      <w:numFmt w:val="bullet"/>
+      <w:lvlText w:val=""/>
+      <w:lvlJc w:val="left"/>
+      <w:pPr>
+        <w:tabs>
+          <w:tab w:val="num" w:pos="5760"/>
+        </w:tabs>
+        <w:ind w:left="5760" w:hanging="360"/>
+      </w:pPr>
+      <w:rPr>
+        <w:rFonts w:ascii="Wingdings" w:hAnsi="Wingdings" w:hint="default"/>
+        <w:sz w:val="20"/>
+      </w:rPr>
+    </w:lvl>
+    <w:lvl w:ilvl="8" w:tentative="1">
+      <w:start w:val="1"/>
+      <w:numFmt w:val="bullet"/>
+      <w:lvlText w:val=""/>
+      <w:lvlJc w:val="left"/>
+      <w:pPr>
+        <w:tabs>
+          <w:tab w:val="num" w:pos="6480"/>
+        </w:tabs>
+        <w:ind w:left="6480" w:hanging="360"/>
+      </w:pPr>
+      <w:rPr>
+        <w:rFonts w:ascii="Wingdings" w:hAnsi="Wingdings" w:hint="default"/>
+        <w:sz w:val="20"/>
+      </w:rPr>
+    </w:lvl>
+  </w:abstractNum>
+  <w:abstractNum w:abstractNumId="11" w15:restartNumberingAfterBreak="0">
+    <w:nsid w:val="09CB5B40"/>
+    <w:multiLevelType w:val="hybridMultilevel"/>
+    <w:tmpl w:val="DF8EF28C"/>
+    <w:lvl w:ilvl="0" w:tplc="04090001">
+      <w:start w:val="1"/>
+      <w:numFmt w:val="bullet"/>
+      <w:lvlText w:val=""/>
+      <w:lvlJc w:val="left"/>
+      <w:pPr>
+        <w:ind w:left="1440" w:hanging="360"/>
+      </w:pPr>
+      <w:rPr>
+        <w:rFonts w:ascii="Symbol" w:hAnsi="Symbol" w:hint="default"/>
+      </w:rPr>
+    </w:lvl>
+    <w:lvl w:ilvl="1" w:tplc="04090003" w:tentative="1">
+      <w:start w:val="1"/>
+      <w:numFmt w:val="bullet"/>
+      <w:lvlText w:val="o"/>
+      <w:lvlJc w:val="left"/>
+      <w:pPr>
+        <w:ind w:left="2160" w:hanging="360"/>
+      </w:pPr>
+      <w:rPr>
+        <w:rFonts w:ascii="Courier New" w:hAnsi="Courier New" w:cs="Courier New" w:hint="default"/>
+      </w:rPr>
+    </w:lvl>
+    <w:lvl w:ilvl="2" w:tplc="04090005" w:tentative="1">
+      <w:start w:val="1"/>
+      <w:numFmt w:val="bullet"/>
+      <w:lvlText w:val=""/>
+      <w:lvlJc w:val="left"/>
+      <w:pPr>
+        <w:ind w:left="2880" w:hanging="360"/>
+      </w:pPr>
+      <w:rPr>
+        <w:rFonts w:ascii="Wingdings" w:hAnsi="Wingdings" w:hint="default"/>
+      </w:rPr>
+    </w:lvl>
+    <w:lvl w:ilvl="3" w:tplc="04090001" w:tentative="1">
+      <w:start w:val="1"/>
+      <w:numFmt w:val="bullet"/>
+      <w:lvlText w:val=""/>
+      <w:lvlJc w:val="left"/>
+      <w:pPr>
+        <w:ind w:left="3600" w:hanging="360"/>
+      </w:pPr>
+      <w:rPr>
+        <w:rFonts w:ascii="Symbol" w:hAnsi="Symbol" w:hint="default"/>
+      </w:rPr>
+    </w:lvl>
+    <w:lvl w:ilvl="4" w:tplc="04090003" w:tentative="1">
+      <w:start w:val="1"/>
+      <w:numFmt w:val="bullet"/>
+      <w:lvlText w:val="o"/>
+      <w:lvlJc w:val="left"/>
+      <w:pPr>
+        <w:ind w:left="4320" w:hanging="360"/>
+      </w:pPr>
+      <w:rPr>
+        <w:rFonts w:ascii="Courier New" w:hAnsi="Courier New" w:cs="Courier New" w:hint="default"/>
+      </w:rPr>
+    </w:lvl>
+    <w:lvl w:ilvl="5" w:tplc="04090005" w:tentative="1">
+      <w:start w:val="1"/>
+      <w:numFmt w:val="bullet"/>
+      <w:lvlText w:val=""/>
+      <w:lvlJc w:val="left"/>
+      <w:pPr>
+        <w:ind w:left="5040" w:hanging="360"/>
+      </w:pPr>
+      <w:rPr>
+        <w:rFonts w:ascii="Wingdings" w:hAnsi="Wingdings" w:hint="default"/>
+      </w:rPr>
+    </w:lvl>
+    <w:lvl w:ilvl="6" w:tplc="04090001" w:tentative="1">
+      <w:start w:val="1"/>
+      <w:numFmt w:val="bullet"/>
+      <w:lvlText w:val=""/>
+      <w:lvlJc w:val="left"/>
+      <w:pPr>
+        <w:ind w:left="5760" w:hanging="360"/>
+      </w:pPr>
+      <w:rPr>
+        <w:rFonts w:ascii="Symbol" w:hAnsi="Symbol" w:hint="default"/>
+      </w:rPr>
+    </w:lvl>
+    <w:lvl w:ilvl="7" w:tplc="04090003" w:tentative="1">
+      <w:start w:val="1"/>
+      <w:numFmt w:val="bullet"/>
+      <w:lvlText w:val="o"/>
+      <w:lvlJc w:val="left"/>
+      <w:pPr>
+        <w:ind w:left="6480" w:hanging="360"/>
+      </w:pPr>
+      <w:rPr>
+        <w:rFonts w:ascii="Courier New" w:hAnsi="Courier New" w:cs="Courier New" w:hint="default"/>
+      </w:rPr>
+    </w:lvl>
+    <w:lvl w:ilvl="8" w:tplc="04090005" w:tentative="1">
+      <w:start w:val="1"/>
+      <w:numFmt w:val="bullet"/>
+      <w:lvlText w:val=""/>
+      <w:lvlJc w:val="left"/>
+      <w:pPr>
+        <w:ind w:left="7200" w:hanging="360"/>
+      </w:pPr>
+      <w:rPr>
+        <w:rFonts w:ascii="Wingdings" w:hAnsi="Wingdings" w:hint="default"/>
+      </w:rPr>
+    </w:lvl>
+  </w:abstractNum>
+  <w:abstractNum w:abstractNumId="12" w15:restartNumberingAfterBreak="0">
     <w:nsid w:val="124E72A1"/>
     <w:multiLevelType w:val="multilevel"/>
     <w:tmpl w:val="CF8EFA14"/>
@@ -9118,7 +9806,7 @@
       </w:rPr>
     </w:lvl>
   </w:abstractNum>
-  <w:abstractNum w:abstractNumId="9" w15:restartNumberingAfterBreak="0">
+  <w:abstractNum w:abstractNumId="13" w15:restartNumberingAfterBreak="0">
     <w:nsid w:val="253B7E0C"/>
     <w:multiLevelType w:val="multilevel"/>
     <w:tmpl w:val="33C09294"/>
@@ -9267,7 +9955,7 @@
       </w:rPr>
     </w:lvl>
   </w:abstractNum>
-  <w:abstractNum w:abstractNumId="10" w15:restartNumberingAfterBreak="0">
+  <w:abstractNum w:abstractNumId="14" w15:restartNumberingAfterBreak="0">
     <w:nsid w:val="2A8329A1"/>
     <w:multiLevelType w:val="multilevel"/>
     <w:tmpl w:val="828229A8"/>
@@ -9416,7 +10104,120 @@
       </w:rPr>
     </w:lvl>
   </w:abstractNum>
-  <w:abstractNum w:abstractNumId="11" w15:restartNumberingAfterBreak="0">
+  <w:abstractNum w:abstractNumId="15" w15:restartNumberingAfterBreak="0">
+    <w:nsid w:val="2F993995"/>
+    <w:multiLevelType w:val="hybridMultilevel"/>
+    <w:tmpl w:val="7CA67736"/>
+    <w:lvl w:ilvl="0" w:tplc="04090001">
+      <w:start w:val="1"/>
+      <w:numFmt w:val="bullet"/>
+      <w:lvlText w:val=""/>
+      <w:lvlJc w:val="left"/>
+      <w:pPr>
+        <w:ind w:left="1440" w:hanging="360"/>
+      </w:pPr>
+      <w:rPr>
+        <w:rFonts w:ascii="Symbol" w:hAnsi="Symbol" w:hint="default"/>
+      </w:rPr>
+    </w:lvl>
+    <w:lvl w:ilvl="1" w:tplc="04090003" w:tentative="1">
+      <w:start w:val="1"/>
+      <w:numFmt w:val="bullet"/>
+      <w:lvlText w:val="o"/>
+      <w:lvlJc w:val="left"/>
+      <w:pPr>
+        <w:ind w:left="2160" w:hanging="360"/>
+      </w:pPr>
+      <w:rPr>
+        <w:rFonts w:ascii="Courier New" w:hAnsi="Courier New" w:cs="Courier New" w:hint="default"/>
+      </w:rPr>
+    </w:lvl>
+    <w:lvl w:ilvl="2" w:tplc="04090005" w:tentative="1">
+      <w:start w:val="1"/>
+      <w:numFmt w:val="bullet"/>
+      <w:lvlText w:val=""/>
+      <w:lvlJc w:val="left"/>
+      <w:pPr>
+        <w:ind w:left="2880" w:hanging="360"/>
+      </w:pPr>
+      <w:rPr>
+        <w:rFonts w:ascii="Wingdings" w:hAnsi="Wingdings" w:hint="default"/>
+      </w:rPr>
+    </w:lvl>
+    <w:lvl w:ilvl="3" w:tplc="04090001" w:tentative="1">
+      <w:start w:val="1"/>
+      <w:numFmt w:val="bullet"/>
+      <w:lvlText w:val=""/>
+      <w:lvlJc w:val="left"/>
+      <w:pPr>
+        <w:ind w:left="3600" w:hanging="360"/>
+      </w:pPr>
+      <w:rPr>
+        <w:rFonts w:ascii="Symbol" w:hAnsi="Symbol" w:hint="default"/>
+      </w:rPr>
+    </w:lvl>
+    <w:lvl w:ilvl="4" w:tplc="04090003" w:tentative="1">
+      <w:start w:val="1"/>
+      <w:numFmt w:val="bullet"/>
+      <w:lvlText w:val="o"/>
+      <w:lvlJc w:val="left"/>
+      <w:pPr>
+        <w:ind w:left="4320" w:hanging="360"/>
+      </w:pPr>
+      <w:rPr>
+        <w:rFonts w:ascii="Courier New" w:hAnsi="Courier New" w:cs="Courier New" w:hint="default"/>
+      </w:rPr>
+    </w:lvl>
+    <w:lvl w:ilvl="5" w:tplc="04090005" w:tentative="1">
+      <w:start w:val="1"/>
+      <w:numFmt w:val="bullet"/>
+      <w:lvlText w:val=""/>
+      <w:lvlJc w:val="left"/>
+      <w:pPr>
+        <w:ind w:left="5040" w:hanging="360"/>
+      </w:pPr>
+      <w:rPr>
+        <w:rFonts w:ascii="Wingdings" w:hAnsi="Wingdings" w:hint="default"/>
+      </w:rPr>
+    </w:lvl>
+    <w:lvl w:ilvl="6" w:tplc="04090001" w:tentative="1">
+      <w:start w:val="1"/>
+      <w:numFmt w:val="bullet"/>
+      <w:lvlText w:val=""/>
+      <w:lvlJc w:val="left"/>
+      <w:pPr>
+        <w:ind w:left="5760" w:hanging="360"/>
+      </w:pPr>
+      <w:rPr>
+        <w:rFonts w:ascii="Symbol" w:hAnsi="Symbol" w:hint="default"/>
+      </w:rPr>
+    </w:lvl>
+    <w:lvl w:ilvl="7" w:tplc="04090003" w:tentative="1">
+      <w:start w:val="1"/>
+      <w:numFmt w:val="bullet"/>
+      <w:lvlText w:val="o"/>
+      <w:lvlJc w:val="left"/>
+      <w:pPr>
+        <w:ind w:left="6480" w:hanging="360"/>
+      </w:pPr>
+      <w:rPr>
+        <w:rFonts w:ascii="Courier New" w:hAnsi="Courier New" w:cs="Courier New" w:hint="default"/>
+      </w:rPr>
+    </w:lvl>
+    <w:lvl w:ilvl="8" w:tplc="04090005" w:tentative="1">
+      <w:start w:val="1"/>
+      <w:numFmt w:val="bullet"/>
+      <w:lvlText w:val=""/>
+      <w:lvlJc w:val="left"/>
+      <w:pPr>
+        <w:ind w:left="7200" w:hanging="360"/>
+      </w:pPr>
+      <w:rPr>
+        <w:rFonts w:ascii="Wingdings" w:hAnsi="Wingdings" w:hint="default"/>
+      </w:rPr>
+    </w:lvl>
+  </w:abstractNum>
+  <w:abstractNum w:abstractNumId="16" w15:restartNumberingAfterBreak="0">
     <w:nsid w:val="30CF2A8E"/>
     <w:multiLevelType w:val="multilevel"/>
     <w:tmpl w:val="33C09294"/>
@@ -9565,7 +10366,7 @@
       </w:rPr>
     </w:lvl>
   </w:abstractNum>
-  <w:abstractNum w:abstractNumId="12" w15:restartNumberingAfterBreak="0">
+  <w:abstractNum w:abstractNumId="17" w15:restartNumberingAfterBreak="0">
     <w:nsid w:val="397155B2"/>
     <w:multiLevelType w:val="multilevel"/>
     <w:tmpl w:val="33C09294"/>
@@ -9714,7 +10515,7 @@
       </w:rPr>
     </w:lvl>
   </w:abstractNum>
-  <w:abstractNum w:abstractNumId="13" w15:restartNumberingAfterBreak="0">
+  <w:abstractNum w:abstractNumId="18" w15:restartNumberingAfterBreak="0">
     <w:nsid w:val="45A050D7"/>
     <w:multiLevelType w:val="multilevel"/>
     <w:tmpl w:val="297854F0"/>
@@ -9863,7 +10664,7 @@
       </w:rPr>
     </w:lvl>
   </w:abstractNum>
-  <w:abstractNum w:abstractNumId="14" w15:restartNumberingAfterBreak="0">
+  <w:abstractNum w:abstractNumId="19" w15:restartNumberingAfterBreak="0">
     <w:nsid w:val="4E420959"/>
     <w:multiLevelType w:val="multilevel"/>
     <w:tmpl w:val="33C09294"/>
@@ -10012,7 +10813,119 @@
       </w:rPr>
     </w:lvl>
   </w:abstractNum>
-  <w:abstractNum w:abstractNumId="15" w15:restartNumberingAfterBreak="0">
+  <w:abstractNum w:abstractNumId="20" w15:restartNumberingAfterBreak="0">
+    <w:nsid w:val="51EA5785"/>
+    <w:multiLevelType w:val="hybridMultilevel"/>
+    <w:tmpl w:val="595EF332"/>
+    <w:lvl w:ilvl="0" w:tplc="9F74BE3A">
+      <w:numFmt w:val="bullet"/>
+      <w:lvlText w:val=""/>
+      <w:lvlJc w:val="left"/>
+      <w:pPr>
+        <w:ind w:left="1080" w:hanging="360"/>
+      </w:pPr>
+      <w:rPr>
+        <w:rFonts w:ascii="Symbol" w:eastAsia="Times New Roman" w:hAnsi="Symbol" w:cs="Times New Roman" w:hint="default"/>
+      </w:rPr>
+    </w:lvl>
+    <w:lvl w:ilvl="1" w:tplc="04090003" w:tentative="1">
+      <w:start w:val="1"/>
+      <w:numFmt w:val="bullet"/>
+      <w:lvlText w:val="o"/>
+      <w:lvlJc w:val="left"/>
+      <w:pPr>
+        <w:ind w:left="1800" w:hanging="360"/>
+      </w:pPr>
+      <w:rPr>
+        <w:rFonts w:ascii="Courier New" w:hAnsi="Courier New" w:cs="Courier New" w:hint="default"/>
+      </w:rPr>
+    </w:lvl>
+    <w:lvl w:ilvl="2" w:tplc="04090005" w:tentative="1">
+      <w:start w:val="1"/>
+      <w:numFmt w:val="bullet"/>
+      <w:lvlText w:val=""/>
+      <w:lvlJc w:val="left"/>
+      <w:pPr>
+        <w:ind w:left="2520" w:hanging="360"/>
+      </w:pPr>
+      <w:rPr>
+        <w:rFonts w:ascii="Wingdings" w:hAnsi="Wingdings" w:hint="default"/>
+      </w:rPr>
+    </w:lvl>
+    <w:lvl w:ilvl="3" w:tplc="04090001" w:tentative="1">
+      <w:start w:val="1"/>
+      <w:numFmt w:val="bullet"/>
+      <w:lvlText w:val=""/>
+      <w:lvlJc w:val="left"/>
+      <w:pPr>
+        <w:ind w:left="3240" w:hanging="360"/>
+      </w:pPr>
+      <w:rPr>
+        <w:rFonts w:ascii="Symbol" w:hAnsi="Symbol" w:hint="default"/>
+      </w:rPr>
+    </w:lvl>
+    <w:lvl w:ilvl="4" w:tplc="04090003" w:tentative="1">
+      <w:start w:val="1"/>
+      <w:numFmt w:val="bullet"/>
+      <w:lvlText w:val="o"/>
+      <w:lvlJc w:val="left"/>
+      <w:pPr>
+        <w:ind w:left="3960" w:hanging="360"/>
+      </w:pPr>
+      <w:rPr>
+        <w:rFonts w:ascii="Courier New" w:hAnsi="Courier New" w:cs="Courier New" w:hint="default"/>
+      </w:rPr>
+    </w:lvl>
+    <w:lvl w:ilvl="5" w:tplc="04090005" w:tentative="1">
+      <w:start w:val="1"/>
+      <w:numFmt w:val="bullet"/>
+      <w:lvlText w:val=""/>
+      <w:lvlJc w:val="left"/>
+      <w:pPr>
+        <w:ind w:left="4680" w:hanging="360"/>
+      </w:pPr>
+      <w:rPr>
+        <w:rFonts w:ascii="Wingdings" w:hAnsi="Wingdings" w:hint="default"/>
+      </w:rPr>
+    </w:lvl>
+    <w:lvl w:ilvl="6" w:tplc="04090001" w:tentative="1">
+      <w:start w:val="1"/>
+      <w:numFmt w:val="bullet"/>
+      <w:lvlText w:val=""/>
+      <w:lvlJc w:val="left"/>
+      <w:pPr>
+        <w:ind w:left="5400" w:hanging="360"/>
+      </w:pPr>
+      <w:rPr>
+        <w:rFonts w:ascii="Symbol" w:hAnsi="Symbol" w:hint="default"/>
+      </w:rPr>
+    </w:lvl>
+    <w:lvl w:ilvl="7" w:tplc="04090003" w:tentative="1">
+      <w:start w:val="1"/>
+      <w:numFmt w:val="bullet"/>
+      <w:lvlText w:val="o"/>
+      <w:lvlJc w:val="left"/>
+      <w:pPr>
+        <w:ind w:left="6120" w:hanging="360"/>
+      </w:pPr>
+      <w:rPr>
+        <w:rFonts w:ascii="Courier New" w:hAnsi="Courier New" w:cs="Courier New" w:hint="default"/>
+      </w:rPr>
+    </w:lvl>
+    <w:lvl w:ilvl="8" w:tplc="04090005" w:tentative="1">
+      <w:start w:val="1"/>
+      <w:numFmt w:val="bullet"/>
+      <w:lvlText w:val=""/>
+      <w:lvlJc w:val="left"/>
+      <w:pPr>
+        <w:ind w:left="6840" w:hanging="360"/>
+      </w:pPr>
+      <w:rPr>
+        <w:rFonts w:ascii="Wingdings" w:hAnsi="Wingdings" w:hint="default"/>
+      </w:rPr>
+    </w:lvl>
+  </w:abstractNum>
+  <w:abstractNum w:abstractNumId="21" w15:restartNumberingAfterBreak="0">
     <w:nsid w:val="539D756E"/>
     <w:multiLevelType w:val="multilevel"/>
     <w:tmpl w:val="33C09294"/>
@@ -10161,7 +11074,7 @@
       </w:rPr>
     </w:lvl>
   </w:abstractNum>
-  <w:abstractNum w:abstractNumId="16" w15:restartNumberingAfterBreak="0">
+  <w:abstractNum w:abstractNumId="22" w15:restartNumberingAfterBreak="0">
     <w:nsid w:val="5F562851"/>
     <w:multiLevelType w:val="multilevel"/>
     <w:tmpl w:val="33C09294"/>
@@ -10310,7 +11223,380 @@
       </w:rPr>
     </w:lvl>
   </w:abstractNum>
-  <w:abstractNum w:abstractNumId="17" w15:restartNumberingAfterBreak="0">
+  <w:abstractNum w:abstractNumId="23" w15:restartNumberingAfterBreak="0">
+    <w:nsid w:val="614F5273"/>
+    <w:multiLevelType w:val="hybridMultilevel"/>
+    <w:tmpl w:val="8D7693D4"/>
+    <w:lvl w:ilvl="0" w:tplc="9F74BE3A">
+      <w:numFmt w:val="bullet"/>
+      <w:lvlText w:val=""/>
+      <w:lvlJc w:val="left"/>
+      <w:pPr>
+        <w:ind w:left="1800" w:hanging="360"/>
+      </w:pPr>
+      <w:rPr>
+        <w:rFonts w:ascii="Symbol" w:eastAsia="Times New Roman" w:hAnsi="Symbol" w:cs="Times New Roman" w:hint="default"/>
+      </w:rPr>
+    </w:lvl>
+    <w:lvl w:ilvl="1" w:tplc="04090003" w:tentative="1">
+      <w:start w:val="1"/>
+      <w:numFmt w:val="bullet"/>
+      <w:lvlText w:val="o"/>
+      <w:lvlJc w:val="left"/>
+      <w:pPr>
+        <w:ind w:left="2160" w:hanging="360"/>
+      </w:pPr>
+      <w:rPr>
+        <w:rFonts w:ascii="Courier New" w:hAnsi="Courier New" w:cs="Courier New" w:hint="default"/>
+      </w:rPr>
+    </w:lvl>
+    <w:lvl w:ilvl="2" w:tplc="04090005" w:tentative="1">
+      <w:start w:val="1"/>
+      <w:numFmt w:val="bullet"/>
+      <w:lvlText w:val=""/>
+      <w:lvlJc w:val="left"/>
+      <w:pPr>
+        <w:ind w:left="2880" w:hanging="360"/>
+      </w:pPr>
+      <w:rPr>
+        <w:rFonts w:ascii="Wingdings" w:hAnsi="Wingdings" w:hint="default"/>
+      </w:rPr>
+    </w:lvl>
+    <w:lvl w:ilvl="3" w:tplc="04090001" w:tentative="1">
+      <w:start w:val="1"/>
+      <w:numFmt w:val="bullet"/>
+      <w:lvlText w:val=""/>
+      <w:lvlJc w:val="left"/>
+      <w:pPr>
+        <w:ind w:left="3600" w:hanging="360"/>
+      </w:pPr>
+      <w:rPr>
+        <w:rFonts w:ascii="Symbol" w:hAnsi="Symbol" w:hint="default"/>
+      </w:rPr>
+    </w:lvl>
+    <w:lvl w:ilvl="4" w:tplc="04090003" w:tentative="1">
+      <w:start w:val="1"/>
+      <w:numFmt w:val="bullet"/>
+      <w:lvlText w:val="o"/>
+      <w:lvlJc w:val="left"/>
+      <w:pPr>
+        <w:ind w:left="4320" w:hanging="360"/>
+      </w:pPr>
+      <w:rPr>
+        <w:rFonts w:ascii="Courier New" w:hAnsi="Courier New" w:cs="Courier New" w:hint="default"/>
+      </w:rPr>
+    </w:lvl>
+    <w:lvl w:ilvl="5" w:tplc="04090005" w:tentative="1">
+      <w:start w:val="1"/>
+      <w:numFmt w:val="bullet"/>
+      <w:lvlText w:val=""/>
+      <w:lvlJc w:val="left"/>
+      <w:pPr>
+        <w:ind w:left="5040" w:hanging="360"/>
+      </w:pPr>
+      <w:rPr>
+        <w:rFonts w:ascii="Wingdings" w:hAnsi="Wingdings" w:hint="default"/>
+      </w:rPr>
+    </w:lvl>
+    <w:lvl w:ilvl="6" w:tplc="04090001" w:tentative="1">
+      <w:start w:val="1"/>
+      <w:numFmt w:val="bullet"/>
+      <w:lvlText w:val=""/>
+      <w:lvlJc w:val="left"/>
+      <w:pPr>
+        <w:ind w:left="5760" w:hanging="360"/>
+      </w:pPr>
+      <w:rPr>
+        <w:rFonts w:ascii="Symbol" w:hAnsi="Symbol" w:hint="default"/>
+      </w:rPr>
+    </w:lvl>
+    <w:lvl w:ilvl="7" w:tplc="04090003" w:tentative="1">
+      <w:start w:val="1"/>
+      <w:numFmt w:val="bullet"/>
+      <w:lvlText w:val="o"/>
+      <w:lvlJc w:val="left"/>
+      <w:pPr>
+        <w:ind w:left="6480" w:hanging="360"/>
+      </w:pPr>
+      <w:rPr>
+        <w:rFonts w:ascii="Courier New" w:hAnsi="Courier New" w:cs="Courier New" w:hint="default"/>
+      </w:rPr>
+    </w:lvl>
+    <w:lvl w:ilvl="8" w:tplc="04090005" w:tentative="1">
+      <w:start w:val="1"/>
+      <w:numFmt w:val="bullet"/>
+      <w:lvlText w:val=""/>
+      <w:lvlJc w:val="left"/>
+      <w:pPr>
+        <w:ind w:left="7200" w:hanging="360"/>
+      </w:pPr>
+      <w:rPr>
+        <w:rFonts w:ascii="Wingdings" w:hAnsi="Wingdings" w:hint="default"/>
+      </w:rPr>
+    </w:lvl>
+  </w:abstractNum>
+  <w:abstractNum w:abstractNumId="24" w15:restartNumberingAfterBreak="0">
+    <w:nsid w:val="68F4199E"/>
+    <w:multiLevelType w:val="hybridMultilevel"/>
+    <w:tmpl w:val="69F20412"/>
+    <w:lvl w:ilvl="0" w:tplc="9F74BE3A">
+      <w:numFmt w:val="bullet"/>
+      <w:lvlText w:val=""/>
+      <w:lvlJc w:val="left"/>
+      <w:pPr>
+        <w:ind w:left="1080" w:hanging="360"/>
+      </w:pPr>
+      <w:rPr>
+        <w:rFonts w:ascii="Symbol" w:eastAsia="Times New Roman" w:hAnsi="Symbol" w:cs="Times New Roman" w:hint="default"/>
+      </w:rPr>
+    </w:lvl>
+    <w:lvl w:ilvl="1" w:tplc="04090003" w:tentative="1">
+      <w:start w:val="1"/>
+      <w:numFmt w:val="bullet"/>
+      <w:lvlText w:val="o"/>
+      <w:lvlJc w:val="left"/>
+      <w:pPr>
+        <w:ind w:left="1800" w:hanging="360"/>
+      </w:pPr>
+      <w:rPr>
+        <w:rFonts w:ascii="Courier New" w:hAnsi="Courier New" w:cs="Courier New" w:hint="default"/>
+      </w:rPr>
+    </w:lvl>
+    <w:lvl w:ilvl="2" w:tplc="04090005" w:tentative="1">
+      <w:start w:val="1"/>
+      <w:numFmt w:val="bullet"/>
+      <w:lvlText w:val=""/>
+      <w:lvlJc w:val="left"/>
+      <w:pPr>
+        <w:ind w:left="2520" w:hanging="360"/>
+      </w:pPr>
+      <w:rPr>
+        <w:rFonts w:ascii="Wingdings" w:hAnsi="Wingdings" w:hint="default"/>
+      </w:rPr>
+    </w:lvl>
+    <w:lvl w:ilvl="3" w:tplc="04090001" w:tentative="1">
+      <w:start w:val="1"/>
+      <w:numFmt w:val="bullet"/>
+      <w:lvlText w:val=""/>
+      <w:lvlJc w:val="left"/>
+      <w:pPr>
+        <w:ind w:left="3240" w:hanging="360"/>
+      </w:pPr>
+      <w:rPr>
+        <w:rFonts w:ascii="Symbol" w:hAnsi="Symbol" w:hint="default"/>
+      </w:rPr>
+    </w:lvl>
+    <w:lvl w:ilvl="4" w:tplc="04090003" w:tentative="1">
+      <w:start w:val="1"/>
+      <w:numFmt w:val="bullet"/>
+      <w:lvlText w:val="o"/>
+      <w:lvlJc w:val="left"/>
+      <w:pPr>
+        <w:ind w:left="3960" w:hanging="360"/>
+      </w:pPr>
+      <w:rPr>
+        <w:rFonts w:ascii="Courier New" w:hAnsi="Courier New" w:cs="Courier New" w:hint="default"/>
+      </w:rPr>
+    </w:lvl>
+    <w:lvl w:ilvl="5" w:tplc="04090005" w:tentative="1">
+      <w:start w:val="1"/>
+      <w:numFmt w:val="bullet"/>
+      <w:lvlText w:val=""/>
+      <w:lvlJc w:val="left"/>
+      <w:pPr>
+        <w:ind w:left="4680" w:hanging="360"/>
+      </w:pPr>
+      <w:rPr>
+        <w:rFonts w:ascii="Wingdings" w:hAnsi="Wingdings" w:hint="default"/>
+      </w:rPr>
+    </w:lvl>
+    <w:lvl w:ilvl="6" w:tplc="04090001" w:tentative="1">
+      <w:start w:val="1"/>
+      <w:numFmt w:val="bullet"/>
+      <w:lvlText w:val=""/>
+      <w:lvlJc w:val="left"/>
+      <w:pPr>
+        <w:ind w:left="5400" w:hanging="360"/>
+      </w:pPr>
+      <w:rPr>
+        <w:rFonts w:ascii="Symbol" w:hAnsi="Symbol" w:hint="default"/>
+      </w:rPr>
+    </w:lvl>
+    <w:lvl w:ilvl="7" w:tplc="04090003" w:tentative="1">
+      <w:start w:val="1"/>
+      <w:numFmt w:val="bullet"/>
+      <w:lvlText w:val="o"/>
+      <w:lvlJc w:val="left"/>
+      <w:pPr>
+        <w:ind w:left="6120" w:hanging="360"/>
+      </w:pPr>
+      <w:rPr>
+        <w:rFonts w:ascii="Courier New" w:hAnsi="Courier New" w:cs="Courier New" w:hint="default"/>
+      </w:rPr>
+    </w:lvl>
+    <w:lvl w:ilvl="8" w:tplc="04090005" w:tentative="1">
+      <w:start w:val="1"/>
+      <w:numFmt w:val="bullet"/>
+      <w:lvlText w:val=""/>
+      <w:lvlJc w:val="left"/>
+      <w:pPr>
+        <w:ind w:left="6840" w:hanging="360"/>
+      </w:pPr>
+      <w:rPr>
+        <w:rFonts w:ascii="Wingdings" w:hAnsi="Wingdings" w:hint="default"/>
+      </w:rPr>
+    </w:lvl>
+  </w:abstractNum>
+  <w:abstractNum w:abstractNumId="25" w15:restartNumberingAfterBreak="0">
+    <w:nsid w:val="6B852C40"/>
+    <w:multiLevelType w:val="multilevel"/>
+    <w:tmpl w:val="A3D82E78"/>
+    <w:lvl w:ilvl="0">
+      <w:start w:val="1"/>
+      <w:numFmt w:val="bullet"/>
+      <w:lvlText w:val=""/>
+      <w:lvlJc w:val="left"/>
+      <w:pPr>
+        <w:tabs>
+          <w:tab w:val="num" w:pos="720"/>
+        </w:tabs>
+        <w:ind w:left="720" w:hanging="360"/>
+      </w:pPr>
+      <w:rPr>
+        <w:rFonts w:ascii="Symbol" w:hAnsi="Symbol" w:hint="default"/>
+        <w:sz w:val="20"/>
+      </w:rPr>
+    </w:lvl>
+    <w:lvl w:ilvl="1" w:tentative="1">
+      <w:start w:val="1"/>
+      <w:numFmt w:val="bullet"/>
+      <w:lvlText w:val="o"/>
+      <w:lvlJc w:val="left"/>
+      <w:pPr>
+        <w:tabs>
+          <w:tab w:val="num" w:pos="1440"/>
+        </w:tabs>
+        <w:ind w:left="1440" w:hanging="360"/>
+      </w:pPr>
+      <w:rPr>
+        <w:rFonts w:ascii="Courier New" w:hAnsi="Courier New" w:hint="default"/>
+        <w:sz w:val="20"/>
+      </w:rPr>
+    </w:lvl>
+    <w:lvl w:ilvl="2" w:tentative="1">
+      <w:start w:val="1"/>
+      <w:numFmt w:val="bullet"/>
+      <w:lvlText w:val=""/>
+      <w:lvlJc w:val="left"/>
+      <w:pPr>
+        <w:tabs>
+          <w:tab w:val="num" w:pos="2160"/>
+        </w:tabs>
+        <w:ind w:left="2160" w:hanging="360"/>
+      </w:pPr>
+      <w:rPr>
+        <w:rFonts w:ascii="Wingdings" w:hAnsi="Wingdings" w:hint="default"/>
+        <w:sz w:val="20"/>
+      </w:rPr>
+    </w:lvl>
+    <w:lvl w:ilvl="3" w:tentative="1">
+      <w:start w:val="1"/>
+      <w:numFmt w:val="bullet"/>
+      <w:lvlText w:val=""/>
+      <w:lvlJc w:val="left"/>
+      <w:pPr>
+        <w:tabs>
+          <w:tab w:val="num" w:pos="2880"/>
+        </w:tabs>
+        <w:ind w:left="2880" w:hanging="360"/>
+      </w:pPr>
+      <w:rPr>
+        <w:rFonts w:ascii="Wingdings" w:hAnsi="Wingdings" w:hint="default"/>
+        <w:sz w:val="20"/>
+      </w:rPr>
+    </w:lvl>
+    <w:lvl w:ilvl="4" w:tentative="1">
+      <w:start w:val="1"/>
+      <w:numFmt w:val="bullet"/>
+      <w:lvlText w:val=""/>
+      <w:lvlJc w:val="left"/>
+      <w:pPr>
+        <w:tabs>
+          <w:tab w:val="num" w:pos="3600"/>
+        </w:tabs>
+        <w:ind w:left="3600" w:hanging="360"/>
+      </w:pPr>
+      <w:rPr>
+        <w:rFonts w:ascii="Wingdings" w:hAnsi="Wingdings" w:hint="default"/>
+        <w:sz w:val="20"/>
+      </w:rPr>
+    </w:lvl>
+    <w:lvl w:ilvl="5" w:tentative="1">
+      <w:start w:val="1"/>
+      <w:numFmt w:val="bullet"/>
+      <w:lvlText w:val=""/>
+      <w:lvlJc w:val="left"/>
+      <w:pPr>
+        <w:tabs>
+          <w:tab w:val="num" w:pos="4320"/>
+        </w:tabs>
+        <w:ind w:left="4320" w:hanging="360"/>
+      </w:pPr>
+      <w:rPr>
+        <w:rFonts w:ascii="Wingdings" w:hAnsi="Wingdings" w:hint="default"/>
+        <w:sz w:val="20"/>
+      </w:rPr>
+    </w:lvl>
+    <w:lvl w:ilvl="6" w:tentative="1">
+      <w:start w:val="1"/>
+      <w:numFmt w:val="bullet"/>
+      <w:lvlText w:val=""/>
+      <w:lvlJc w:val="left"/>
+      <w:pPr>
+        <w:tabs>
+          <w:tab w:val="num" w:pos="5040"/>
+        </w:tabs>
+        <w:ind w:left="5040" w:hanging="360"/>
+      </w:pPr>
+      <w:rPr>
+        <w:rFonts w:ascii="Wingdings" w:hAnsi="Wingdings" w:hint="default"/>
+        <w:sz w:val="20"/>
+      </w:rPr>
+    </w:lvl>
+    <w:lvl w:ilvl="7" w:tentative="1">
+      <w:start w:val="1"/>
+      <w:numFmt w:val="bullet"/>
+      <w:lvlText w:val=""/>
+      <w:lvlJc w:val="left"/>
+      <w:pPr>
+        <w:tabs>
+          <w:tab w:val="num" w:pos="5760"/>
+        </w:tabs>
+        <w:ind w:left="5760" w:hanging="360"/>
+      </w:pPr>
+      <w:rPr>
+        <w:rFonts w:ascii="Wingdings" w:hAnsi="Wingdings" w:hint="default"/>
+        <w:sz w:val="20"/>
+      </w:rPr>
+    </w:lvl>
+    <w:lvl w:ilvl="8" w:tentative="1">
+      <w:start w:val="1"/>
+      <w:numFmt w:val="bullet"/>
+      <w:lvlText w:val=""/>
+      <w:lvlJc w:val="left"/>
+      <w:pPr>
+        <w:tabs>
+          <w:tab w:val="num" w:pos="6480"/>
+        </w:tabs>
+        <w:ind w:left="6480" w:hanging="360"/>
+      </w:pPr>
+      <w:rPr>
+        <w:rFonts w:ascii="Wingdings" w:hAnsi="Wingdings" w:hint="default"/>
+        <w:sz w:val="20"/>
+      </w:rPr>
+    </w:lvl>
+  </w:abstractNum>
+  <w:abstractNum w:abstractNumId="26" w15:restartNumberingAfterBreak="0">
     <w:nsid w:val="74583034"/>
     <w:multiLevelType w:val="multilevel"/>
     <w:tmpl w:val="33C09294"/>
@@ -10459,7 +11745,7 @@
       </w:rPr>
     </w:lvl>
   </w:abstractNum>
-  <w:abstractNum w:abstractNumId="18" w15:restartNumberingAfterBreak="0">
+  <w:abstractNum w:abstractNumId="27" w15:restartNumberingAfterBreak="0">
     <w:nsid w:val="76752A0B"/>
     <w:multiLevelType w:val="multilevel"/>
     <w:tmpl w:val="33C09294"/>
@@ -10608,7 +11894,7 @@
       </w:rPr>
     </w:lvl>
   </w:abstractNum>
-  <w:abstractNum w:abstractNumId="19" w15:restartNumberingAfterBreak="0">
+  <w:abstractNum w:abstractNumId="28" w15:restartNumberingAfterBreak="0">
     <w:nsid w:val="79D07839"/>
     <w:multiLevelType w:val="multilevel"/>
     <w:tmpl w:val="33C09294"/>
@@ -10776,46 +12062,73 @@
     <w:abstractNumId w:val="0"/>
   </w:num>
   <w:num w:numId="7">
-    <w:abstractNumId w:val="8"/>
+    <w:abstractNumId w:val="12"/>
   </w:num>
   <w:num w:numId="8">
-    <w:abstractNumId w:val="10"/>
+    <w:abstractNumId w:val="14"/>
   </w:num>
   <w:num w:numId="9">
-    <w:abstractNumId w:val="13"/>
+    <w:abstractNumId w:val="18"/>
   </w:num>
   <w:num w:numId="10">
-    <w:abstractNumId w:val="15"/>
+    <w:abstractNumId w:val="21"/>
   </w:num>
   <w:num w:numId="11">
+    <w:abstractNumId w:val="28"/>
+  </w:num>
+  <w:num w:numId="12">
     <w:abstractNumId w:val="19"/>
   </w:num>
-  <w:num w:numId="12">
-    <w:abstractNumId w:val="14"/>
-  </w:num>
   <w:num w:numId="13">
-    <w:abstractNumId w:val="18"/>
+    <w:abstractNumId w:val="27"/>
   </w:num>
   <w:num w:numId="14">
-    <w:abstractNumId w:val="16"/>
+    <w:abstractNumId w:val="22"/>
   </w:num>
   <w:num w:numId="15">
-    <w:abstractNumId w:val="9"/>
+    <w:abstractNumId w:val="13"/>
   </w:num>
   <w:num w:numId="16">
     <w:abstractNumId w:val="7"/>
   </w:num>
   <w:num w:numId="17">
-    <w:abstractNumId w:val="11"/>
+    <w:abstractNumId w:val="16"/>
   </w:num>
   <w:num w:numId="18">
     <w:abstractNumId w:val="6"/>
   </w:num>
   <w:num w:numId="19">
+    <w:abstractNumId w:val="26"/>
+  </w:num>
+  <w:num w:numId="20">
     <w:abstractNumId w:val="17"/>
   </w:num>
-  <w:num w:numId="20">
-    <w:abstractNumId w:val="12"/>
+  <w:num w:numId="21">
+    <w:abstractNumId w:val="15"/>
+  </w:num>
+  <w:num w:numId="22">
+    <w:abstractNumId w:val="11"/>
+  </w:num>
+  <w:num w:numId="23">
+    <w:abstractNumId w:val="20"/>
+  </w:num>
+  <w:num w:numId="24">
+    <w:abstractNumId w:val="9"/>
+  </w:num>
+  <w:num w:numId="25">
+    <w:abstractNumId w:val="24"/>
+  </w:num>
+  <w:num w:numId="26">
+    <w:abstractNumId w:val="23"/>
+  </w:num>
+  <w:num w:numId="27">
+    <w:abstractNumId w:val="25"/>
+  </w:num>
+  <w:num w:numId="28">
+    <w:abstractNumId w:val="10"/>
+  </w:num>
+  <w:num w:numId="29">
+    <w:abstractNumId w:val="8"/>
   </w:num>
   <w:numIdMacAtCleanup w:val="20"/>
 </w:numbering>
@@ -22718,7 +24031,7 @@
 </file>
 
 <file path=customXml/itemProps1.xml><?xml version="1.0" encoding="utf-8"?>
-<ds:datastoreItem xmlns:ds="http://schemas.openxmlformats.org/officeDocument/2006/customXml" ds:itemID="{E41A45E7-38CD-456C-BE81-44D977FFDD24}">
+<ds:datastoreItem xmlns:ds="http://schemas.openxmlformats.org/officeDocument/2006/customXml" ds:itemID="{349A04C9-5211-4873-A212-409BA50E8B00}">
   <ds:schemaRefs>
     <ds:schemaRef ds:uri="http://schemas.openxmlformats.org/officeDocument/2006/bibliography"/>
   </ds:schemaRefs>

</xml_diff>